<commit_message>
Manuscript: replace dated diagnostic-method claims with current standards and reviews
Rewrites the Background paragraph that cited 2010 and 2004 qPCR assay papers
as evidence for current practice. The claim now rests on the EPPO PM 7/24 (5)
protocol (2023), the WOAH Terrestrial Manual brucellosis chapter (2022) and
2024-2025 reviews. Case-study introductions cite a 2025 nanopore clinical
study, 2022 long-read Xylella metagenomics, a 2026 Brucella metagenomic
investigation and a 2025 adaptive-sampling benchmark. References renumbered
in order of first citation (34 entries), two comments added explaining the
changes and listing references to verify.

Co-Authored-By: Claude Fable 5.1 <noreply@anthropic.com>
Claude-Session: https://claude.ai/code/session_01F2N3jbTqGRkPKsBGy6Zcev
</commit_message>
<xml_diff>
--- a/docs/paper/nanoCAS_BMC_Bioinformatics_draft.docx
+++ b/docs/paper/nanoCAS_BMC_Bioinformatics_draft.docx
@@ -109,19 +109,7 @@
         <w:rPr>
           <w:rFonts w:ascii="Times New Roman" w:hAnsi="Times New Roman" w:cs="Times New Roman"/>
         </w:rPr>
-        <w:t xml:space="preserve"> Agriculture and Agri-Food Canada, </w:t>
-      </w:r>
-      <w:r>
-        <w:rPr>
-          <w:rFonts w:ascii="Times New Roman" w:hAnsi="Times New Roman" w:cs="Times New Roman"/>
-        </w:rPr>
-        <w:t>Brandon</w:t>
-      </w:r>
-      <w:r>
-        <w:rPr>
-          <w:rFonts w:ascii="Times New Roman" w:hAnsi="Times New Roman" w:cs="Times New Roman"/>
-        </w:rPr>
-        <w:t xml:space="preserve"> Research and Development Centre, Saskatoon, Saskatchewan, Canada</w:t>
+        <w:t xml:space="preserve"> Agriculture and Agri-Food Canada, Brandon Research and Development Centre, Saskatoon, Saskatchewan, Canada</w:t>
       </w:r>
     </w:p>
     <w:p>
@@ -297,37 +285,7 @@
         <w:rPr>
           <w:rFonts w:ascii="Times New Roman" w:hAnsi="Times New Roman" w:cs="Times New Roman"/>
         </w:rPr>
-        <w:t>We present nanoCAS (Nanopore Classification and Alerting System), an open-source web application that watches an Oxford Nanopore sequencer's output, classifies each new batch of reads against user-defined targets and sends an alert the moment a threshold is crossed. Thresholds can be set on depth, breadth, read count or read fraction for any target, and on depth over individual features from a GFF3 annotation. The classifier is a plug-in: minimap2, Kraken2 and Centrifuge are included, and another tool can b</w:t>
-      </w:r>
-      <w:r>
-        <w:rPr>
-          <w:rFonts w:ascii="Times New Roman" w:hAnsi="Times New Roman" w:cs="Times New Roman"/>
-        </w:rPr>
-        <w:t xml:space="preserve">e added </w:t>
-      </w:r>
-      <w:r>
-        <w:rPr>
-          <w:rFonts w:ascii="Times New Roman" w:hAnsi="Times New Roman" w:cs="Times New Roman"/>
-        </w:rPr>
-        <w:t>by instantiating</w:t>
-      </w:r>
-      <w:r>
-        <w:rPr>
-          <w:rFonts w:ascii="Times New Roman" w:hAnsi="Times New Roman" w:cs="Times New Roman"/>
-        </w:rPr>
-        <w:t xml:space="preserve"> a </w:t>
-      </w:r>
-      <w:r>
-        <w:rPr>
-          <w:rFonts w:ascii="Times New Roman" w:hAnsi="Times New Roman" w:cs="Times New Roman"/>
-        </w:rPr>
-        <w:t>Python class. A second monitor reads the sequencing summary written by MinKNOW and alerts on the run itself, such as a run that never started, stalled output or declining pore activity. Alerts go out by e-mail, SMS, desktop notification and into MinKNOW. Quantitative PCR results can be recorded per target, and agreement, time to detection and the relationship between cycle threshold and read yield are computed in the application. A built-in simulator lets every function be tried without an instrument. We ap</w:t>
-      </w:r>
-      <w:r>
-        <w:rPr>
-          <w:rFonts w:ascii="Times New Roman" w:hAnsi="Times New Roman" w:cs="Times New Roman"/>
-        </w:rPr>
-        <w:t xml:space="preserve">plied nanoCAS to naturally infected plant samples carrying </w:t>
+        <w:t xml:space="preserve">We present nanoCAS (Nanopore Classification and Alerting System), an open-source web application that watches an Oxford Nanopore sequencer's output, classifies each new batch of reads against user-defined targets and sends an alert the moment a threshold is crossed. Thresholds can be set on depth, breadth, read count or read fraction for any target, and on depth over individual features from a GFF3 annotation. The classifier is a plug-in: minimap2, Kraken2 and Centrifuge are included, and another tool can be added by instantiating a Python class. A second monitor reads the sequencing summary written by MinKNOW and alerts on the run itself, such as a run that never started, stalled output or declining pore activity. Alerts go out by e-mail, SMS, desktop notification and into MinKNOW. Quantitative PCR results can be recorded per target, and agreement, time to detection and the relationship between cycle threshold and read yield are computed in the application. A built-in simulator lets every function be tried without an instrument. We applied nanoCAS to naturally infected plant samples carrying </w:t>
       </w:r>
       <w:r>
         <w:rPr>
@@ -406,19 +364,7 @@
         <w:rPr>
           <w:rFonts w:ascii="Times New Roman" w:hAnsi="Times New Roman" w:cs="Times New Roman"/>
         </w:rPr>
-        <w:t xml:space="preserve">nanoCAS turns a nanopore run into a monitored process that tells </w:t>
-      </w:r>
-      <w:r>
-        <w:rPr>
-          <w:rFonts w:ascii="Times New Roman" w:hAnsi="Times New Roman" w:cs="Times New Roman"/>
-        </w:rPr>
-        <w:t>user</w:t>
-      </w:r>
-      <w:r>
-        <w:rPr>
-          <w:rFonts w:ascii="Times New Roman" w:hAnsi="Times New Roman" w:cs="Times New Roman"/>
-        </w:rPr>
-        <w:t xml:space="preserve"> when something they care about has happened. It is a decision layer on top of whichever classifier a laboratory already trusts, and it records the evidence needed to validate that decision against a reference test.</w:t>
+        <w:t xml:space="preserve">nanoCAS turns a nanopore run into a monitored process that tells user when something they care about has happened. It is a decision layer on top of whichever classifier a laboratory already trusts, and it records the evidence needed to validate that decision against a reference test.</w:t>
       </w:r>
     </w:p>
     <w:p>
@@ -509,13 +455,7 @@
           <w:rFonts w:ascii="Times New Roman" w:hAnsi="Times New Roman" w:cs="Times New Roman"/>
         </w:rPr>
         <w:lastRenderedPageBreak/>
-        <w:t>The value of a diagnostic result depends on when it arrives. In a livestock herd or a crop, a pathogen that is identified early can be contained by isolating animals, removing plants or changing a treatment plan, and one that is identified late has already spread. In a clinical setting the same logic applies to the choice of an antimicrobial or the decision to isolate a patient. Sequencing-based diagnostics have shown that a causative organism can be identified from a clinical sample within hours [1, 2], bu</w:t>
-      </w:r>
-      <w:r>
-        <w:rPr>
-          <w:rFonts w:ascii="Times New Roman" w:hAnsi="Times New Roman" w:cs="Times New Roman"/>
-        </w:rPr>
-        <w:t>t the time from sample to answer is only part of the picture. The other part is how quickly the answer reaches the person who has to act on it.</w:t>
+        <w:t>The value of a diagnostic result depends on when it arrives. In a livestock herd or a crop, a pathogen that is identified early can be contained by isolating animals, removing plants or changing a treatment plan, and one that is identified late has already spread. In a clinical setting the same logic applies to the choice of an antimicrobial or the decision to isolate a patient. Sequencing-based diagnostics have shown that a causative organism can be identified from a clinical sample within hours [1-3], but the time from sample to answer is only part of the picture. The other part is how quickly the answer reaches the person who has to act on it.</w:t>
       </w:r>
     </w:p>
     <w:p>
@@ -525,11 +465,12 @@
           <w:rFonts w:ascii="Times New Roman" w:hAnsi="Times New Roman" w:cs="Times New Roman"/>
         </w:rPr>
       </w:pPr>
-      <w:r>
-        <w:rPr>
-          <w:rFonts w:ascii="Times New Roman" w:hAnsi="Times New Roman" w:cs="Times New Roman"/>
-        </w:rPr>
-        <w:t xml:space="preserve">Most routine pathogen testing still relies on culture or on targeted amplification. Quantitative PCR (qPCR) assays exist for many agricultural pathogens, including </w:t>
+      <w:commentRangeStart w:id="23"/>
+      <w:r>
+        <w:rPr>
+          <w:rFonts w:ascii="Times New Roman" w:hAnsi="Times New Roman" w:cs="Times New Roman"/>
+        </w:rPr>
+        <w:t xml:space="preserve">Routine pathogen testing still relies on culture, serology and targeted amplification, and the diagnostic standards that apply to the two organisms in this study are recent. The EPPO diagnostic protocol for </w:t>
       </w:r>
       <w:r>
         <w:rPr>
@@ -537,13 +478,13 @@
           <w:i/>
           <w:iCs/>
         </w:rPr>
-        <w:t>Xylella fastidiosa</w:t>
-      </w:r>
-      <w:r>
-        <w:rPr>
-          <w:rFonts w:ascii="Times New Roman" w:hAnsi="Times New Roman" w:cs="Times New Roman"/>
-        </w:rPr>
-        <w:t xml:space="preserve"> [3] and </w:t>
+        <w:t xml:space="preserve">Xylella fastidiosa</w:t>
+      </w:r>
+      <w:r>
+        <w:rPr>
+          <w:rFonts w:ascii="Times New Roman" w:hAnsi="Times New Roman" w:cs="Times New Roman"/>
+        </w:rPr>
+        <w:t xml:space="preserve">, revised in 2023, is built around real-time PCR [4], and the 2022 revision of the WOAH manual for brucellosis treats isolation of </w:t>
       </w:r>
       <w:r>
         <w:rPr>
@@ -551,19 +492,34 @@
           <w:i/>
           <w:iCs/>
         </w:rPr>
-        <w:t>Brucella</w:t>
-      </w:r>
-      <w:r>
-        <w:rPr>
-          <w:rFonts w:ascii="Times New Roman" w:hAnsi="Times New Roman" w:cs="Times New Roman"/>
-        </w:rPr>
-        <w:t xml:space="preserve"> species [4], and they are sensitive and inexpensive. They also answer only the question that was asked. A qPCR panel cannot report an organism it has no primers for, it gives no information about which genes or plasmids are present, and the result is available only after the cycling program has finished. Metagenomic sequencing answers a broader question at the cost of more DNA input and more analysis, and nanopore sequencing adds a property that no other platform has: reads are delivered continuously while</w:t>
-      </w:r>
-      <w:r>
-        <w:rPr>
-          <w:rFonts w:ascii="Times New Roman" w:hAnsi="Times New Roman" w:cs="Times New Roman"/>
-        </w:rPr>
-        <w:t xml:space="preserve"> the run is in progress, so the analysis can start with the first batch of reads and stop as soon as the answer is clear [5].</w:t>
+        <w:t xml:space="preserve">Brucella</w:t>
+      </w:r>
+      <w:r>
+        <w:rPr>
+          <w:rFonts w:ascii="Times New Roman" w:hAnsi="Times New Roman" w:cs="Times New Roman"/>
+        </w:rPr>
+        <w:t xml:space="preserve"> in culture as the definitive diagnosis, with PCR as an additional means of detecting </w:t>
+      </w:r>
+      <w:r>
+        <w:rPr>
+          <w:rFonts w:ascii="Times New Roman" w:hAnsi="Times New Roman" w:cs="Times New Roman"/>
+          <w:i/>
+          <w:iCs/>
+        </w:rPr>
+        <w:t xml:space="preserve">Brucella</w:t>
+      </w:r>
+      <w:r>
+        <w:rPr>
+          <w:rFonts w:ascii="Times New Roman" w:hAnsi="Times New Roman" w:cs="Times New Roman"/>
+        </w:rPr>
+        <w:t xml:space="preserve"> DNA [5]. Recent reviews of plant and animal pathogen diagnostics describe the same picture, with PCR-based and immunological assays remaining the mainstay of routine practice [6, 7]. These methods are sensitive and inexpensive. They also answer only the question that was asked. A quantitative PCR (qPCR) panel cannot report an organism it has no primers for, it gives no information about which genes or plasmids are present, and the result is available only after the cycling program has finished. Metagenomic sequencing answers a broader question at the cost of more DNA input and more analysis, and nanopore sequencing adds a property that no other platform has: reads are delivered continuously while the run is in progress, so the analysis can start with the first batch of reads and stop as soon as the answer is clear [8].</w:t>
+      </w:r>
+      <w:commentRangeEnd w:id="23"/>
+      <w:r>
+        <w:rPr>
+          <w:rStyle w:val="CommentReference"/>
+        </w:rPr>
+        <w:commentReference w:id="23"/>
       </w:r>
     </w:p>
     <w:p>
@@ -577,19 +533,7 @@
         <w:rPr>
           <w:rFonts w:ascii="Times New Roman" w:hAnsi="Times New Roman" w:cs="Times New Roman"/>
         </w:rPr>
-        <w:t>Several tools already use this property. MinKNOW, the instrument control software from Oxford Nanopore Technologies, can align reads to a reference during a run and draw coverage plots, and the EPI2ME workflows can watch an output directory and update a report as files appear [6]. RAMPART shows amplicon coverage per barcode for viral genome sequencing [7]. minoTour is a laboratory information system that captures run metrics and sequence data from MinKNOW and can run alignment and metagenomic classification</w:t>
-      </w:r>
-      <w:r>
-        <w:rPr>
-          <w:rFonts w:ascii="Times New Roman" w:hAnsi="Times New Roman" w:cs="Times New Roman"/>
-        </w:rPr>
-        <w:t xml:space="preserve"> on them [8]. BoardION monitors instrument performance across flow cells [9]. MARTi [10], Nanometa Live [11] and NanoOK RT [12] classify reads taxonomically while the run is in progress and present the result as an interactive report. Cloud platforms such as BugSeq [13] and general pipelines such as fastv [14] and Sunbeam [15] process the data after the run. Adaptive sampling tools such as readfish [16] act at the signal level to enrich or deplete chosen sequences, and have been shown to enrich low-abundanc</w:t>
-      </w:r>
-      <w:r>
-        <w:rPr>
-          <w:rFonts w:ascii="Times New Roman" w:hAnsi="Times New Roman" w:cs="Times New Roman"/>
-        </w:rPr>
-        <w:t>e species in metagenomic samples [17].</w:t>
+        <w:t xml:space="preserve">Several tools already use this property. MinKNOW, the instrument control software from Oxford Nanopore Technologies, can align reads to a reference during a run and draw coverage plots, and the EPI2ME workflows can watch an output directory and update a report as files appear [9]. RAMPART shows amplicon coverage per barcode for viral genome sequencing [10]. minoTour is a laboratory information system that captures run metrics and sequence data from MinKNOW and can run alignment and metagenomic classification on them [11]. BoardION monitors instrument performance across flow cells [12]. MARTi [13], Nanometa Live [14] and NanoOK RT [15] classify reads taxonomically while the run is in progress and present the result as an interactive report. Cloud platforms such as BugSeq [16] and general pipelines such as fastv [17] and Sunbeam [18] process the data after the run. Adaptive sampling tools such as readfish [19] act at the signal level to enrich or deplete chosen sequences, and have been shown to enrich low-abundance species in metagenomic samples [20].</w:t>
       </w:r>
     </w:p>
     <w:p>
@@ -603,13 +547,7 @@
         <w:rPr>
           <w:rFonts w:ascii="Times New Roman" w:hAnsi="Times New Roman" w:cs="Times New Roman"/>
         </w:rPr>
-        <w:t>What these tools have in common is that they stop at the plot. The user must sit in front of the screen, decide what a positive result looks like and notice when it appears. None of them let a laboratory state in advance that, for example, ten reads or five-fold depth over a given gene means a positive sample, and then notify a person by text message when that happens. None of them raise an alarm when the instrument is the problem rather than the sample, for instance when a flow cell produces no data or rea</w:t>
-      </w:r>
-      <w:r>
-        <w:rPr>
-          <w:rFonts w:ascii="Times New Roman" w:hAnsi="Times New Roman" w:cs="Times New Roman"/>
-        </w:rPr>
-        <w:t>d quality collapses part way through a run. And none of them keep the confirmatory laboratory result in the same place as the sequencing result, so the comparison between the two is redone by hand in every study.</w:t>
+        <w:t>What these tools have in common is that they stop at the plot. The user must sit in front of the screen, decide what a positive result looks like and notice when it appears. None of them let a laboratory state in advance that, for example, ten reads or five-fold depth over a given gene means a positive sample, and then notify a person by text message when that happens. None of them raise an alarm when the instrument is the problem rather than the sample, for instance when a flow cell produces no data or read quality collapses part way through a run. And none of them keep the confirmatory laboratory result in the same place as the sequencing result, so the comparison between the two is redone by hand in every study.</w:t>
       </w:r>
     </w:p>
     <w:p>
@@ -624,13 +562,7 @@
           <w:rFonts w:ascii="Times New Roman" w:hAnsi="Times New Roman" w:cs="Times New Roman"/>
         </w:rPr>
         <w:lastRenderedPageBreak/>
-        <w:t>nanoCAS was written to fill this gap. It is not a new aligner or classifier. It is the layer that sits on top of an existing classifier, watches the sequencer, evaluates user-defined rules on every new batch of reads and on the state of the run, delivers alerts, and records the evidence that a laboratory needs to validate the rules against a reference test. In this paper we describe the design of nanoCAS and demonstrate it on two case studies: a plant pathogen in naturally infected plant tissue with matchin</w:t>
-      </w:r>
-      <w:r>
-        <w:rPr>
-          <w:rFonts w:ascii="Times New Roman" w:hAnsi="Times New Roman" w:cs="Times New Roman"/>
-        </w:rPr>
-        <w:t>g qPCR data, and an animal pathogen spiked into a bovine background at decreasing concentrations and sequenced with adaptive sampling.</w:t>
+        <w:t>nanoCAS was written to fill this gap. It is not a new aligner or classifier. It is the layer that sits on top of an existing classifier, watches the sequencer, evaluates user-defined rules on every new batch of reads and on the state of the run, delivers alerts, and records the evidence that a laboratory needs to validate the rules against a reference test. In this paper we describe the design of nanoCAS and demonstrate it on two case studies: a plant pathogen in naturally infected plant tissue with matching qPCR data, and an animal pathogen spiked into a bovine background at decreasing concentrations and sequenced with adaptive sampling.</w:t>
       </w:r>
     </w:p>
     <w:p>
@@ -684,13 +616,7 @@
         <w:rPr>
           <w:rFonts w:ascii="Times New Roman" w:hAnsi="Times New Roman" w:cs="Times New Roman"/>
         </w:rPr>
-        <w:t xml:space="preserve">nanoCAS is a single Python process that serves a web interface, a JSON API and the monitoring threads (Fig. 1). The back end is written in Python 3.10 or later on Flask with Flask-SocketIO for live updates to the browser, watchdog for file-system events, pysam and NumPy for alignment processing, and minknow_api for communication with the sequencer. The front end is a React application written in TypeScript with Chart.js for plots. It is compiled once and served by the same process, so a deployment consists </w:t>
-      </w:r>
-      <w:r>
-        <w:rPr>
-          <w:rFonts w:ascii="Times New Roman" w:hAnsi="Times New Roman" w:cs="Times New Roman"/>
-        </w:rPr>
-        <w:t>of one program, the minimap2 and samtools binaries and no external services. Each analysis is a project with its own directory under the user's home directory that holds the configuration, the reference index, one BAM file per processed batch, the rolling coverage state, the coverage time series, the alert log and any laboratory results. Nothing is sent to a remote server and the application works without an internet connection.</w:t>
+        <w:t xml:space="preserve">nanoCAS is a single Python process that serves a web interface, a JSON API and the monitoring threads (Fig. 1). The back end is written in Python 3.10 or later on Flask with Flask-SocketIO for live updates to the browser, watchdog for file-system events, pysam and NumPy for alignment processing, and minknow_api for communication with the sequencer. The front end is a React application written in TypeScript with Chart.js for plots. It is compiled once and served by the same process, so a deployment consists of one program, the minimap2 and samtools binaries and no external services. Each analysis is a project with its own directory under the user's home directory that holds the configuration, the reference index, one BAM file per processed batch, the rolling coverage state, the coverage time series, the alert log and any laboratory results. Nothing is sent to a remote server and the application works without an internet connection.</w:t>
       </w:r>
     </w:p>
     <w:p>
@@ -738,18 +664,7 @@
         <w:rPr>
           <w:rFonts w:ascii="Times New Roman" w:hAnsi="Times New Roman" w:cs="Times New Roman"/>
         </w:rPr>
-        <w:t>When monitoring is active nanoCAS watches the chosen directory, which is normally the fastq_pass folder written by MinKNOW. It accepts FASTQ files, gzipped or not, and BAM files produced by another tool. MinKNOW writes each batch to a temporary name and renames it when complete, and nanoCAS waits for the rename so that partially written files are never processed. Files already present when monitoring starts are processed first, so an analysis can be started or restarted part way through a run without losing</w:t>
-      </w:r>
-      <w:r>
-        <w:rPr>
-          <w:rFonts w:ascii="Times New Roman" w:hAnsi="Times New Roman" w:cs="Times New Roman"/>
-        </w:rPr>
-        <w:t xml:space="preserve"> data. A batch that fails, for example because the aligner ran out of memory, is recorded </w:t>
-      </w:r>
-      <w:r>
-        <w:rPr>
-          <w:rFonts w:ascii="Times New Roman" w:hAnsi="Times New Roman" w:cs="Times New Roman"/>
-        </w:rPr>
+        <w:t xml:space="preserve">When monitoring is active nanoCAS watches the chosen directory, which is normally the fastq_pass folder written by MinKNOW. It accepts FASTQ files, gzipped or not, and BAM files produced by another tool. MinKNOW writes each batch to a temporary name and renames it when complete, and nanoCAS waits for the rename so that partially written files are never processed. Files already present when monitoring starts are processed first, so an analysis can be started or restarted part way through a run without losing data. A batch that fails, for example because the aligner ran out of memory, is recorded </w:t>
         <w:lastRenderedPageBreak/>
         <w:t>and retried on the next start rather than silently skipped. Batches are processed one at a time in the order they arrive.</w:t>
       </w:r>
@@ -785,13 +700,7 @@
         <w:rPr>
           <w:rFonts w:ascii="Times New Roman" w:hAnsi="Times New Roman" w:cs="Times New Roman"/>
         </w:rPr>
-        <w:t>Each batch is passed to a classifier. The default classifier aligns the reads with minimap2 [18] using the nanopore preset and sorts the output with samtools [19]. From the resulting BAM file nanoCAS updates a per-position depth array for every reference sequence. The array is updated incrementally, so the cost of a batch depends on the number of reads in that batch and not on the number of reads seen so far. Depth counts every aligned base regardless of base quality, which matches the behaviour of samtools</w:t>
-      </w:r>
-      <w:r>
-        <w:rPr>
-          <w:rFonts w:ascii="Times New Roman" w:hAnsi="Times New Roman" w:cs="Times New Roman"/>
-        </w:rPr>
-        <w:t xml:space="preserve"> depth, and read counts include primary alignments only. From the arrays nanoCAS derives, for every target and after every batch, the mean depth, the breadth of coverage (the fraction of positions with at least one read), the number of reads and the fraction of all reads in the run so far that were assigned to the target. These four metrics are appended to a coverage time series that drives the coverage-over-time plot (Fig. 2a).</w:t>
+        <w:t xml:space="preserve">Each batch is passed to a classifier. The default classifier aligns the reads with minimap2 [21] using the nanopore preset and sorts the output with samtools [22]. From the resulting BAM file nanoCAS updates a per-position depth array for every reference sequence. The array is updated incrementally, so the cost of a batch depends on the number of reads in that batch and not on the number of reads seen so far. Depth counts every aligned base regardless of base quality, which matches the behaviour of samtools depth, and read counts include primary alignments only. From the arrays nanoCAS derives, for every target and after every batch, the mean depth, the breadth of coverage (the fraction of positions with at least one read), the number of reads and the fraction of all reads in the run so far that were assigned to the target. These four metrics are appended to a coverage time series that drives the coverage-over-time plot (Fig. 2a).</w:t>
       </w:r>
     </w:p>
     <w:p>
@@ -805,13 +714,7 @@
         <w:rPr>
           <w:rFonts w:ascii="Times New Roman" w:hAnsi="Times New Roman" w:cs="Times New Roman"/>
         </w:rPr>
-        <w:t>The classifier is a plug-in. A classifier is a Python class that declares a name, a kind (alignment or taxonomic), how it builds its index from the uploaded reference, and a method that classifies one batch and returns either a BAM file or a table of read counts per taxon. Kraken2 [20] and Centrifuge [21] are included as taxonomic classifiers, in which case the targets are taxon names or NCBI taxonomy identifiers and the available metrics are read count and read fraction. A user can add another tool by plac</w:t>
-      </w:r>
-      <w:r>
-        <w:rPr>
-          <w:rFonts w:ascii="Times New Roman" w:hAnsi="Times New Roman" w:cs="Times New Roman"/>
-        </w:rPr>
-        <w:t>ing a Python file in a plug-ins directory. The alert rules are defined on the metrics rather than on the tool, so a project can be moved from one classifier to another without changing its alerts. An example plug-in that classifies reads by shared k-mers is shipped with the source code and is used by the automated tests.</w:t>
+        <w:t>The classifier is a plug-in. A classifier is a Python class that declares a name, a kind (alignment or taxonomic), how it builds its index from the uploaded reference, and a method that classifies one batch and returns either a BAM file or a table of read counts per taxon. Kraken2 [23] and Centrifuge [24] are included as taxonomic classifiers, in which case the targets are taxon names or NCBI taxonomy identifiers and the available metrics are read count and read fraction. A user can add another tool by placing a Python file in a plug-ins directory. The alert rules are defined on the metrics rather than on the tool, so a project can be moved from one classifier to another without changing its alerts. An example plug-in that classifies reads by shared k-mers is shipped with the source code and is used by the automated tests.</w:t>
       </w:r>
     </w:p>
     <w:p>
@@ -845,13 +748,7 @@
         <w:rPr>
           <w:rFonts w:ascii="Times New Roman" w:hAnsi="Times New Roman" w:cs="Times New Roman"/>
         </w:rPr>
-        <w:t>A target can carry any combination of four thresholds: mean depth, breadth of coverage, read count and read fraction. Each rule is evaluated after every batch and fires once per run. When a GFF3 annotation was uploaded, the user can select individual features, for example a toxin gene or a resistance gene, and give each a depth threshold of its own. Feature rules are evaluated over the feature's coordinates on the same depth arrays and are useful when presence of a gene rather than presence of an organism i</w:t>
-      </w:r>
-      <w:r>
-        <w:rPr>
-          <w:rFonts w:ascii="Times New Roman" w:hAnsi="Times New Roman" w:cs="Times New Roman"/>
-        </w:rPr>
-        <w:t>s the question, for instance to distinguish a virulent strain from a harmless relative or a plasmid backbone from its insert. Feature thresholds can be edited while monitoring is running and take effect from the next batch.</w:t>
+        <w:t>A target can carry any combination of four thresholds: mean depth, breadth of coverage, read count and read fraction. Each rule is evaluated after every batch and fires once per run. When a GFF3 annotation was uploaded, the user can select individual features, for example a toxin gene or a resistance gene, and give each a depth threshold of its own. Feature rules are evaluated over the feature's coordinates on the same depth arrays and are useful when presence of a gene rather than presence of an organism is the question, for instance to distinguish a virulent strain from a harmless relative or a plasmid backbone from its insert. Feature thresholds can be edited while monitoring is running and take effect from the next batch.</w:t>
       </w:r>
     </w:p>
     <w:p>
@@ -886,19 +783,7 @@
           <w:rFonts w:ascii="Times New Roman" w:hAnsi="Times New Roman" w:cs="Times New Roman"/>
         </w:rPr>
         <w:lastRenderedPageBreak/>
-        <w:t>A second thread reads the sequencing summary file that MinKNOW writes alongside the reads. The file is read incrementally, and from each new block of rows nanoCAS maintains a Q-score histogram, a read-length histogram, per-minute throughput, the set of channels that produced reads in the last ten minutes and a rolling window of the most recent reads. Seven rules are evaluated on this state at a fixed interval, by default every 30 seconds (Table 2). Each rule fires only after its condition has held for two c</w:t>
-      </w:r>
-      <w:r>
-        <w:rPr>
-          <w:rFonts w:ascii="Times New Roman" w:hAnsi="Times New Roman" w:cs="Times New Roman"/>
-        </w:rPr>
-        <w:t>onsecutive evaluations and logs a recovery entry when the condition clears, after which it can fire again. This hysteresis prevents a single slow batch from raising an alarm. The flow-cell type is inferred from the highest channel number in the summary, so the active-channel rule uses the correct denominator for a Flongle, MinION or PromethION flow cell. When the project is linked to a sequencing position, the live acquisition state reported by MinKNOW is shown in the interface and is used to suppress the r</w:t>
-      </w:r>
-      <w:r>
-        <w:rPr>
-          <w:rFonts w:ascii="Times New Roman" w:hAnsi="Times New Roman" w:cs="Times New Roman"/>
-        </w:rPr>
-        <w:t>un-not-started rule while the instrument is still preparing. The same summary statistics that post-run tools such as NanoPlot [22] and pycoQC [23] report from a finished run are shown while the run is in progress (Fig. 2b).</w:t>
+        <w:t>A second thread reads the sequencing summary file that MinKNOW writes alongside the reads. The file is read incrementally, and from each new block of rows nanoCAS maintains a Q-score histogram, a read-length histogram, per-minute throughput, the set of channels that produced reads in the last ten minutes and a rolling window of the most recent reads. Seven rules are evaluated on this state at a fixed interval, by default every 30 seconds (Table 2). Each rule fires only after its condition has held for two consecutive evaluations and logs a recovery entry when the condition clears, after which it can fire again. This hysteresis prevents a single slow batch from raising an alarm. The flow-cell type is inferred from the highest channel number in the summary, so the active-channel rule uses the correct denominator for a Flongle, MinION or PromethION flow cell. When the project is linked to a sequencing position, the live acquisition state reported by MinKNOW is shown in the interface and is used to suppress the run-not-started rule while the instrument is still preparing. The same summary statistics that post-run tools such as NanoPlot [25] and pycoQC [26] report from a finished run are shown while the run is in progress (Fig. 2b).</w:t>
       </w:r>
     </w:p>
     <w:p>
@@ -932,13 +817,7 @@
         <w:rPr>
           <w:rFonts w:ascii="Times New Roman" w:hAnsi="Times New Roman" w:cs="Times New Roman"/>
         </w:rPr>
-        <w:t xml:space="preserve">Every alert, whether from a target rule or a run-health rule, carries a severity, a timestamp, a message and the values that triggered it. It is appended to a per-project log, pushed to any open browser session and passed to the configured notification channels: e-mail over SMTP, SMS through Twilio, a desktop notification on the host computer and a user message inside the MinKNOW interface of the linked sequencing position. A test button sends a message through every configured channel so that the delivery </w:t>
-      </w:r>
-      <w:r>
-        <w:rPr>
-          <w:rFonts w:ascii="Times New Roman" w:hAnsi="Times New Roman" w:cs="Times New Roman"/>
-        </w:rPr>
-        <w:t>path can be checked before a run rather than discovered to be broken during one. The alert history is browsable and filterable in the interface (Fig. 2c) and the log file is plain JSON lines so that it can be consumed by other software.</w:t>
+        <w:t xml:space="preserve">Every alert, whether from a target rule or a run-health rule, carries a severity, a timestamp, a message and the values that triggered it. It is appended to a per-project log, pushed to any open browser session and passed to the configured notification channels: e-mail over SMTP, SMS through Twilio, a desktop notification on the host computer and a user message inside the MinKNOW interface of the linked sequencing position. A test button sends a message through every configured channel so that the delivery path can be checked before a run rather than discovered to be broken during one. The alert history is browsable and filterable in the interface (Fig. 2c) and the log file is plain JSON lines so that it can be consumed by other software.</w:t>
       </w:r>
     </w:p>
     <w:p>
@@ -972,13 +851,7 @@
         <w:rPr>
           <w:rFonts w:ascii="Times New Roman" w:hAnsi="Times New Roman" w:cs="Times New Roman"/>
         </w:rPr>
-        <w:t xml:space="preserve">For any target the user can record the result of a reference test, in practice a qPCR assay, as positive, negative or inconclusive together with the cycle threshold (Ct), a sample identifier and a date. nanoCAS then reports, for each target, whether sequencing detected it (that is, whether any of its alert rules fired), the time from the first processed batch to the first alert, and whether the sequencing result agrees with the laboratory result (Fig. 2d). Across targets with a Ct value it fits an ordinary </w:t>
-      </w:r>
-      <w:r>
-        <w:rPr>
-          <w:rFonts w:ascii="Times New Roman" w:hAnsi="Times New Roman" w:cs="Times New Roman"/>
-        </w:rPr>
-        <w:t xml:space="preserve">least-squares regression of log10 reads per million on Ct, reports the slope, the coefficient of determination and a t-test p-value for the slope, and computes Spearman's rank correlation as a distribution-free check. A separate view pools all projects on the same server and reports, for each target, the positivity rate with a Wilson score interval [24], the sensitivity and specificity of sequencing against the laboratory test, Cohen's kappa [25], the median time to detection and </w:t>
+        <w:t xml:space="preserve">For any target the user can record the result of a reference test, in practice a qPCR assay, as positive, negative or inconclusive together with the cycle threshold (Ct), a sample identifier and a date. nanoCAS then reports, for each target, whether sequencing detected it (that is, whether any of its alert rules fired), the time from the first processed batch to the first alert, and whether the sequencing result agrees with the laboratory result (Fig. 2d). Across targets with a Ct value it fits an ordinary least-squares regression of log10 reads per million on Ct, reports the slope, the coefficient of determination and a t-test p-value for the slope, and computes Spearman's rank correlation as a distribution-free check. A separate view pools all projects on the same server and reports, for each target, the positivity rate with a Wilson score interval [27], the sensitivity and specificity of sequencing against the laboratory test, Cohen's kappa [28], the median time to detection and </w:t>
       </w:r>
       <w:commentRangeStart w:id="3"/>
       <w:r>
@@ -1002,11 +875,6 @@
           <w:rFonts w:ascii="Times New Roman" w:hAnsi="Times New Roman" w:cs="Times New Roman"/>
         </w:rPr>
         <w:t xml:space="preserve">. </w:t>
-      </w:r>
-      <w:r>
-        <w:rPr>
-          <w:rFonts w:ascii="Times New Roman" w:hAnsi="Times New Roman" w:cs="Times New Roman"/>
-        </w:rPr>
         <w:lastRenderedPageBreak/>
         <w:t>These are the quantities that validation studies of sequencing-based diagnostics usually report, and computing them inside the application means that each run adds a row to the validation dataset instead of a line in a spreadsheet.</w:t>
       </w:r>
@@ -1042,13 +910,7 @@
         <w:rPr>
           <w:rFonts w:ascii="Times New Roman" w:hAnsi="Times New Roman" w:cs="Times New Roman"/>
         </w:rPr>
-        <w:t>nanoCAS includes a sequencer simulator that writes gzipped FASTQ batches and a sequencing summary in the same layout, naming scheme and timing as MinKNOW. Six scripted scenarios are provided: a clean run, a contamination that appears part way through, a low-abundance pathogen, a flow cell that loses pores, a run that stalls and a run that never starts. A demo project can be created in one click and comes with a replayed history so that the coverage plot, the feature alerts, the run-health alerts, the notifi</w:t>
-      </w:r>
-      <w:r>
-        <w:rPr>
-          <w:rFonts w:ascii="Times New Roman" w:hAnsi="Times New Roman" w:cs="Times New Roman"/>
-        </w:rPr>
-        <w:t>cation channels and the laboratory-result views are all populated without an instrument or any user data. The simulator is also the basis of the automated test suite, which contains 123 tests including an end-to-end test that runs real minimap2 and samtools on simulated reads, and which is executed on every change by continuous integration.</w:t>
+        <w:t>nanoCAS includes a sequencer simulator that writes gzipped FASTQ batches and a sequencing summary in the same layout, naming scheme and timing as MinKNOW. Six scripted scenarios are provided: a clean run, a contamination that appears part way through, a low-abundance pathogen, a flow cell that loses pores, a run that stalls and a run that never starts. A demo project can be created in one click and comes with a replayed history so that the coverage plot, the feature alerts, the run-health alerts, the notification channels and the laboratory-result views are all populated without an instrument or any user data. The simulator is also the basis of the automated test suite, which contains 123 tests including an end-to-end test that runs real minimap2 and samtools on simulated reads, and which is executed on every change by continuous integration.</w:t>
       </w:r>
     </w:p>
     <w:p>
@@ -1153,13 +1015,7 @@
         <w:rPr>
           <w:rFonts w:ascii="Times New Roman" w:hAnsi="Times New Roman" w:cs="Times New Roman"/>
         </w:rPr>
-        <w:t xml:space="preserve"> were collected from [host species, location, year]. DNA was extracted from [tissue type] with [kit or method]. Each extract was tested by real-time PCR using the assay of Harper et al. [3] on a [instrument], and the number of genome copies per reaction was estimated from a standard curve of [describe standard]. Sequencing libraries were prepared with the [ligation or rapid] kit [SQK-xxx] and sequenced on [MinION / GridION] with [flow cell type, chemistry] for [duration]. Basecalling was performed by MinKNO</w:t>
-      </w:r>
-      <w:r>
-        <w:rPr>
-          <w:rFonts w:ascii="Times New Roman" w:hAnsi="Times New Roman" w:cs="Times New Roman"/>
-        </w:rPr>
-        <w:t>W with [Dorado version, model] and reads were written to the fastq_pass directory watched by nanoCAS.</w:t>
+        <w:t xml:space="preserve"> were collected from [host species, location, year]. DNA was extracted from [tissue type] with [kit or method]. Each extract was tested by real-time PCR using the assay of Harper et al. [29] on a [instrument], and the number of genome copies per reaction was estimated from a standard curve of [describe standard]. Sequencing libraries were prepared with the [ligation or rapid] kit [SQK-xxx] and sequenced on [MinION / GridION] with [flow cell type, chemistry] for [duration]. Basecalling was performed by MinKNOW with [Dorado version, model] and reads were written to the fastq_pass directory watched by nanoCAS.</w:t>
       </w:r>
       <w:commentRangeEnd w:id="4"/>
       <w:r>
@@ -1452,19 +1308,7 @@
         <w:rPr>
           <w:rFonts w:ascii="Times New Roman" w:hAnsi="Times New Roman" w:cs="Times New Roman"/>
         </w:rPr>
-        <w:t>Table 1 places nanoCAS next to the real-time tools described in the Background. All of them process reads while the run is in progress and most of them draw coverage or taxonomy plots. The features that separate nanoCAS from the others are the ones that concern what happens after the plot is drawn: user-defined thresholds that fire once and are delivered to a person, rules about the instrument rather than the sample, a classifier that can be swapped without changing the rules, a place to record the confirma</w:t>
-      </w:r>
-      <w:r>
-        <w:rPr>
-          <w:rFonts w:ascii="Times New Roman" w:hAnsi="Times New Roman" w:cs="Times New Roman"/>
-        </w:rPr>
-        <w:t>tory test, and a simulator that lets the whole system be demonstrated and tested without hardware. minoTour comes closest, as it can e-mail the user when amplicon coverage milestones are reached in its ARTIC workflow, but it has no general threshold rules, no instrument rules and no laboratory-result view, and it requires a Django, Celery and Redis deployment. nanoCAS is deliberately narrower than MARTi or Nanometa Live in what it reports about a sample. It does not attempt to describe a whole community. It</w:t>
-      </w:r>
-      <w:r>
-        <w:rPr>
-          <w:rFonts w:ascii="Times New Roman" w:hAnsi="Times New Roman" w:cs="Times New Roman"/>
-        </w:rPr>
-        <w:t xml:space="preserve"> answers the question a diagnostic laboratory asks, which is whether a named organism or gene is present above a stated level, and it says so as soon as the answer is known.</w:t>
+        <w:t xml:space="preserve">Table 1 places nanoCAS next to the real-time tools described in the Background. All of them process reads while the run is in progress and most of them draw coverage or taxonomy plots. The features that separate nanoCAS from the others are the ones that concern what happens after the plot is drawn: user-defined thresholds that fire once and are delivered to a person, rules about the instrument rather than the sample, a classifier that can be swapped without changing the rules, a place to record the confirmatory test, and a simulator that lets the whole system be demonstrated and tested without hardware. minoTour comes closest, as it can e-mail the user when amplicon coverage milestones are reached in its ARTIC workflow, but it has no general threshold rules, no instrument rules and no laboratory-result view, and it requires a Django, Celery and Redis deployment. nanoCAS is deliberately narrower than MARTi or Nanometa Live in what it reports about a sample. It does not attempt to describe a whole community. It answers the question a diagnostic laboratory asks, which is whether a named organism or gene is present above a stated level, and it says so as soon as the answer is known.</w:t>
       </w:r>
     </w:p>
     <w:p>
@@ -1501,13 +1345,13 @@
           <w:i/>
           <w:iCs/>
         </w:rPr>
-        <w:t>X. fastidiosa</w:t>
-      </w:r>
-      <w:r>
-        <w:rPr>
-          <w:rFonts w:ascii="Times New Roman" w:hAnsi="Times New Roman" w:cs="Times New Roman"/>
-        </w:rPr>
-        <w:t xml:space="preserve"> is a xylem-limited bacterium that causes disease in olive, grapevine, citrus and many other hosts and is a quarantine organism in much of the world [26]. Detection in plant tissue is difficult because the bacterium is unevenly distributed in the plant and present at low titre relative to host DNA, and the current reference method is qPCR [3]. Direct nanopore sequencing has detected </w:t>
+        <w:t xml:space="preserve">X. fastidiosa</w:t>
+      </w:r>
+      <w:r>
+        <w:rPr>
+          <w:rFonts w:ascii="Times New Roman" w:hAnsi="Times New Roman" w:cs="Times New Roman"/>
+        </w:rPr>
+        <w:t xml:space="preserve"> is a xylem-limited bacterium that causes disease in olive, grapevine, citrus and many other hosts and is a quarantine organism in much of the world [30]. Detection in plant tissue is difficult because the bacterium is unevenly distributed in the plant and present at low titre relative to host DNA, and the methods prescribed by the current EPPO protocol are real-time PCR assays, among them the assay of Harper et al. that was used here [4, 29]. Direct nanopore sequencing has detected </w:t>
       </w:r>
       <w:r>
         <w:rPr>
@@ -1515,13 +1359,13 @@
           <w:i/>
           <w:iCs/>
         </w:rPr>
-        <w:t>X. fastidiosa</w:t>
-      </w:r>
-      <w:r>
-        <w:rPr>
-          <w:rFonts w:ascii="Times New Roman" w:hAnsi="Times New Roman" w:cs="Times New Roman"/>
-        </w:rPr>
-        <w:t xml:space="preserve"> in naturally infected material but was reported to succeed only at high bacterial load, with amplicon sequencing needed for low-titre samples [5]. This case study asks a different question. Given a set of naturally infected samples spanning a range of qPCR Ct values, how does the point at which nanoCAS raises an alert, and the depth and breadth it reports, relate to the amount of pathogen DNA that qPCR measured?</w:t>
+        <w:t xml:space="preserve">X. fastidiosa</w:t>
+      </w:r>
+      <w:r>
+        <w:rPr>
+          <w:rFonts w:ascii="Times New Roman" w:hAnsi="Times New Roman" w:cs="Times New Roman"/>
+        </w:rPr>
+        <w:t xml:space="preserve"> in naturally infected material but was reported to succeed only at high bacterial load, with amplicon sequencing needed for low-titre samples [8], and long-read metagenomic sequencing of an infected grapevine has since yielded a genome assembly of sufficient quality for phylogenetic placement [31]. This case study asks a different question. Given a set of naturally infected samples spanning a range of qPCR Ct values, how does the point at which nanoCAS raises an alert, and the depth and breadth it reports, relate to the amount of pathogen DNA that qPCR measured?</w:t>
       </w:r>
     </w:p>
     <w:p>
@@ -1589,13 +1433,7 @@
         <w:rPr>
           <w:rFonts w:ascii="Times New Roman" w:hAnsi="Times New Roman" w:cs="Times New Roman"/>
         </w:rPr>
-        <w:t xml:space="preserve"> decreased linearly with Ct (slope [b], R2 [r2], p [p], Spearman rho [rho], Fig. 3b), which is the relationship expected when both measurements scale with the number of pathogen genomes in the extract. Breadth of coverage was a less useful predictor: it saturated near 100% in the [k] samples with Ct below [value] and fell steeply above that, so it separated strong positives from weak ones but did not rank samples within either group (Fig. 3c). Mean depth behaved like read count because the reference genome </w:t>
-      </w:r>
-      <w:r>
-        <w:rPr>
-          <w:rFonts w:ascii="Times New Roman" w:hAnsi="Times New Roman" w:cs="Times New Roman"/>
-        </w:rPr>
-        <w:t>is fixed, and read fraction removed the effect of differences in total yield between runs, which made it the most comparable metric across flow cells.</w:t>
+        <w:t xml:space="preserve"> decreased linearly with Ct (slope [b], R2 [r2], p [p], Spearman rho [rho], Fig. 3b), which is the relationship expected when both measurements scale with the number of pathogen genomes in the extract. Breadth of coverage was a less useful predictor: it saturated near 100% in the [k] samples with Ct below [value] and fell steeply above that, so it separated strong positives from weak ones but did not rank samples within either group (Fig. 3c). Mean depth behaved like read count because the reference genome is fixed, and read fraction removed the effect of differences in total yield between runs, which made it the most comparable metric across flow cells.</w:t>
       </w:r>
       <w:commentRangeEnd w:id="10"/>
       <w:r>
@@ -1672,41 +1510,13 @@
           <w:i/>
           <w:iCs/>
         </w:rPr>
-        <w:t>B. abortus</w:t>
-      </w:r>
-      <w:r>
-        <w:rPr>
-          <w:rFonts w:ascii="Times New Roman" w:hAnsi="Times New Roman" w:cs="Times New Roman"/>
-        </w:rPr>
-        <w:t xml:space="preserve">, is a notifiable zoonosis that is controlled by test-and-slaughter programs in most countries [27]. The organism is present at low levels in tissues and fluids against an overwhelming excess of host DNA, so direct sequencing without enrichment yields few pathogen reads. Adaptive sampling offers a way to shift the balance during the run, because reads that do not map to the pathogen genome are ejected from the pore after the first few hundred bases and the pore is freed for the </w:t>
-      </w:r>
-      <w:r>
-        <w:rPr>
-          <w:rFonts w:ascii="Times New Roman" w:hAnsi="Times New Roman" w:cs="Times New Roman"/>
-        </w:rPr>
-        <w:lastRenderedPageBreak/>
-        <w:t xml:space="preserve">next molecule [16, 17]. This </w:t>
-      </w:r>
-      <w:r>
-        <w:rPr>
-          <w:rFonts w:ascii="Times New Roman" w:hAnsi="Times New Roman" w:cs="Times New Roman"/>
-        </w:rPr>
-        <w:t>case study asks how far down a dilution series nanoCAS can raise an alert, how much sooner the alert arrives when adaptive sampling is enabled, and whether the run-health monitor adds anything over a three-day run.</w:t>
-      </w:r>
-    </w:p>
-    <w:p>
-      <w:pPr>
-        <w:spacing w:after="160" w:line="360" w:lineRule="auto"/>
-        <w:rPr>
-          <w:rFonts w:ascii="Times New Roman" w:hAnsi="Times New Roman" w:cs="Times New Roman"/>
-        </w:rPr>
-      </w:pPr>
-      <w:commentRangeStart w:id="12"/>
-      <w:r>
-        <w:rPr>
-          <w:rFonts w:ascii="Times New Roman" w:hAnsi="Times New Roman" w:cs="Times New Roman"/>
-        </w:rPr>
-        <w:t xml:space="preserve">In the 30-minute baseline without adaptive sampling, </w:t>
+        <w:t xml:space="preserve">B. abortus</w:t>
+      </w:r>
+      <w:r>
+        <w:rPr>
+          <w:rFonts w:ascii="Times New Roman" w:hAnsi="Times New Roman" w:cs="Times New Roman"/>
+        </w:rPr>
+        <w:t xml:space="preserve">, is a notifiable zoonosis. The WOAH manual prescribes serological screening with confirmation by isolation of the organism, which takes days to weeks, and recent reviews still list culture, serology and PCR as the diagnostic repertoire [5, 7]. Shotgun metagenomic sequencing has reported </w:t>
       </w:r>
       <w:r>
         <w:rPr>
@@ -1714,13 +1524,28 @@
           <w:i/>
           <w:iCs/>
         </w:rPr>
-        <w:t>B. abortus</w:t>
-      </w:r>
-      <w:r>
-        <w:rPr>
-          <w:rFonts w:ascii="Times New Roman" w:hAnsi="Times New Roman" w:cs="Times New Roman"/>
-        </w:rPr>
-        <w:t xml:space="preserve"> reads made up [x]% of reads at the highest spike level and were [not observed / observed at y%] at the lowest (Table 4). After adaptive sampling was enabled, the </w:t>
+        <w:t xml:space="preserve">B. abortus</w:t>
+      </w:r>
+      <w:r>
+        <w:rPr>
+          <w:rFonts w:ascii="Times New Roman" w:hAnsi="Times New Roman" w:cs="Times New Roman"/>
+        </w:rPr>
+        <w:t xml:space="preserve"> in a bovine abortion investigation within 72 hours of sample receipt [32], but the organism is present at low levels in tissues and fluids against an overwhelming excess of host DNA, so direct sequencing without enrichment yields few pathogen reads. Adaptive sampling offers a way to shift the balance during the run, because reads that do not map to the pathogen genome are ejected from the pore after the first few hundred bases and the pore is freed for the next molecule [19, 20], and a 2025 benchmark of adaptive sampling tools reports the enrichment that can be expected for a target species in a mixed sample [33]. This case study asks how far down a dilution series nanoCAS can raise an alert, how much sooner the alert arrives when adaptive sampling is enabled, and whether the run-health monitor adds anything over a three-day run.</w:t>
+      </w:r>
+    </w:p>
+    <w:p>
+      <w:pPr>
+        <w:spacing w:after="160" w:line="360" w:lineRule="auto"/>
+        <w:rPr>
+          <w:rFonts w:ascii="Times New Roman" w:hAnsi="Times New Roman" w:cs="Times New Roman"/>
+        </w:rPr>
+      </w:pPr>
+      <w:commentRangeStart w:id="12"/>
+      <w:r>
+        <w:rPr>
+          <w:rFonts w:ascii="Times New Roman" w:hAnsi="Times New Roman" w:cs="Times New Roman"/>
+        </w:rPr>
+        <w:t xml:space="preserve">In the 30-minute baseline without adaptive sampling, </w:t>
       </w:r>
       <w:r>
         <w:rPr>
@@ -1734,7 +1559,21 @@
         <w:rPr>
           <w:rFonts w:ascii="Times New Roman" w:hAnsi="Times New Roman" w:cs="Times New Roman"/>
         </w:rPr>
-        <w:t xml:space="preserve"> read fraction rose by a factor of [fold] to [fold] across the levels (Fig. 4a), in line with the enrichment reported for low-abundance species in mock communities [17]. nanoCAS raised an alert at every level down to [lowest detected level], with time to alert increasing from [t1] at the highest level to [t2] at the lowest (Fig. 4b). At [level(s) below that], no alert was raised within three days, and the read count at the end of the run was [n] reads, below the [threshold] read threshold.</w:t>
+        <w:t xml:space="preserve"> reads made up [x]% of reads at the highest spike level and were [not observed / observed at y%] at the lowest (Table 4). After adaptive sampling was enabled, the </w:t>
+      </w:r>
+      <w:r>
+        <w:rPr>
+          <w:rFonts w:ascii="Times New Roman" w:hAnsi="Times New Roman" w:cs="Times New Roman"/>
+          <w:i/>
+          <w:iCs/>
+        </w:rPr>
+        <w:t>B. abortus</w:t>
+      </w:r>
+      <w:r>
+        <w:rPr>
+          <w:rFonts w:ascii="Times New Roman" w:hAnsi="Times New Roman" w:cs="Times New Roman"/>
+        </w:rPr>
+        <w:t xml:space="preserve"> read fraction rose by a factor of [fold] to [fold] across the levels (Fig. 4a), in line with the enrichment reported for low-abundance species in mock communities [20]. nanoCAS raised an alert at every level down to [lowest detected level], with time to alert increasing from [t1] at the highest level to [t2] at the lowest (Fig. 4b). At [level(s) below that], no alert was raised within three days, and the read count at the end of the run was [n] reads, below the [threshold] read threshold.</w:t>
       </w:r>
       <w:commentRangeEnd w:id="12"/>
       <w:r>
@@ -1759,7 +1598,7 @@
         <w:rPr>
           <w:rFonts w:ascii="Times New Roman" w:hAnsi="Times New Roman" w:cs="Times New Roman"/>
         </w:rPr>
-        <w:t xml:space="preserve">Breadth of coverage at the end of the run was [value] at the highest level and [value] at the lowest detected level, so at low input the reads were spread thinly across the 3.3 Mb genome rather than concentrated. This is the situation in which feature-level rules are informative: a depth threshold over a single marker such as the IS711 element or the </w:t>
+        <w:t xml:space="preserve">Breadth of coverage at the end of the run was [value] at the highest level and [value] at the lowest detected level, so at low input the reads were spread thinly across the 3.3 Mb genome rather than concentrated. This is the situation in which feature-level rules are informative: a depth threshold over a single marker such as the IS711 element that is the target of the reference real-time PCR for the genus [34], or the </w:t>
       </w:r>
       <w:r>
         <w:rPr>
@@ -1842,13 +1681,7 @@
         <w:rPr>
           <w:rFonts w:ascii="Times New Roman" w:hAnsi="Times New Roman" w:cs="Times New Roman"/>
         </w:rPr>
-        <w:t>nanoCAS starts at basecalled reads. It does not basecall and it does not act at the signal level, so adaptive sampling is configured in MinKNOW or in a dedicated tool and nanoCAS observes its effect rather than controlling it. It does not assemble genomes, call variants or detect antimicrobial resistance genes, and a laboratory that needs those results will run a separate pipeline after the run. The taxonomic view is a table rather than a tree, and the statistics across runs are descriptive. The case studie</w:t>
-      </w:r>
-      <w:r>
-        <w:rPr>
-          <w:rFonts w:ascii="Times New Roman" w:hAnsi="Times New Roman" w:cs="Times New Roman"/>
-        </w:rPr>
-        <w:t xml:space="preserve">s use one pathogen in one background each and were not designed as validation studies with negative controls at every level, so the sensitivity and specificity that nanoCAS reports for them should be read as a demonstration of the feature rather than as performance claims for </w:t>
+        <w:t xml:space="preserve">nanoCAS starts at basecalled reads. It does not basecall and it does not act at the signal level, so adaptive sampling is configured in MinKNOW or in a dedicated tool and nanoCAS observes its effect rather than controlling it. It does not assemble genomes, call variants or detect antimicrobial resistance genes, and a laboratory that needs those results will run a separate pipeline after the run. The taxonomic view is a table rather than a tree, and the statistics across runs are descriptive. The case studies use one pathogen in one background each and were not designed as validation studies with negative controls at every level, so the sensitivity and specificity that nanoCAS reports for them should be read as a demonstration of the feature rather than as performance claims for </w:t>
       </w:r>
       <w:r>
         <w:rPr>
@@ -1877,11 +1710,6 @@
           <w:rFonts w:ascii="Times New Roman" w:hAnsi="Times New Roman" w:cs="Times New Roman"/>
         </w:rPr>
         <w:t xml:space="preserve"> detection. Finally, the alert thresholds are chosen by the user, and the appropriate values depend on the organism, the reference and the background, </w:t>
-      </w:r>
-      <w:r>
-        <w:rPr>
-          <w:rFonts w:ascii="Times New Roman" w:hAnsi="Times New Roman" w:cs="Times New Roman"/>
-        </w:rPr>
         <w:lastRenderedPageBreak/>
         <w:t>which is why nanoCAS records the reference result alongside the sequencing result: the intended use is that a laboratory tunes its thresholds on its own validation runs.</w:t>
       </w:r>
@@ -1917,19 +1745,7 @@
         <w:rPr>
           <w:rFonts w:ascii="Times New Roman" w:hAnsi="Times New Roman" w:cs="Times New Roman"/>
         </w:rPr>
-        <w:t xml:space="preserve">nanoCAS makes a nanopore sequencing run behave like a monitored instrument. A laboratory states in advance what a positive result is, in terms of depth, breadth, reads or read fraction over an organism or a gene, and is told when that result is reached. It is also told when the run itself is failing. The classifier underneath is a choice, not a commitment, and the confirmatory test result lives next to the sequencing result so that every run contributes to the validation of the rules. In naturally infected </w:t>
-      </w:r>
-      <w:r>
-        <w:rPr>
-          <w:rFonts w:ascii="Times New Roman" w:hAnsi="Times New Roman" w:cs="Times New Roman"/>
-        </w:rPr>
-        <w:t xml:space="preserve">plant material the time to alert and the read yield followed the qPCR cycle threshold, and in a dilution series with adaptive sampling nanoCAS detected the pathogen </w:t>
-      </w:r>
-      <w:r>
-        <w:rPr>
-          <w:rFonts w:ascii="Times New Roman" w:hAnsi="Times New Roman" w:cs="Times New Roman"/>
-        </w:rPr>
-        <w:t xml:space="preserve">down to </w:t>
+        <w:t xml:space="preserve">nanoCAS makes a nanopore sequencing run behave like a monitored instrument. A laboratory states in advance what a positive result is, in terms of depth, breadth, reads or read fraction over an organism or a gene, and is told when that result is reached. It is also told when the run itself is failing. The classifier underneath is a choice, not a commitment, and the confirmatory test result lives next to the sequencing result so that every run contributes to the validation of the rules. In naturally infected plant material the time to alert and the read yield followed the qPCR cycle threshold, and in a dilution series with adaptive sampling nanoCAS detected the pathogen down to </w:t>
       </w:r>
       <w:r>
         <w:rPr>
@@ -2247,13 +2063,7 @@
           <w:rFonts w:ascii="Times New Roman" w:hAnsi="Times New Roman" w:cs="Times New Roman"/>
         </w:rPr>
         <w:lastRenderedPageBreak/>
-        <w:t xml:space="preserve">No human participants were involved. </w:t>
-      </w:r>
-      <w:r>
-        <w:rPr>
-          <w:rFonts w:ascii="Times New Roman" w:hAnsi="Times New Roman" w:cs="Times New Roman"/>
-        </w:rPr>
-        <w:t xml:space="preserve">If the bovine samples came from live animals, state the animal care committee approval number. </w:t>
+        <w:t xml:space="preserve">No human participants were involved. If the bovine samples came from live animals, state the animal care committee approval number. </w:t>
       </w:r>
       <w:r>
         <w:rPr>
@@ -2407,19 +2217,7 @@
         <w:rPr>
           <w:rFonts w:ascii="Times New Roman" w:hAnsi="Times New Roman" w:cs="Times New Roman"/>
         </w:rPr>
-        <w:t xml:space="preserve">TS and MGL conceived the project. TS </w:t>
-      </w:r>
-      <w:r>
-        <w:rPr>
-          <w:rFonts w:ascii="Times New Roman" w:hAnsi="Times New Roman" w:cs="Times New Roman"/>
-        </w:rPr>
-        <w:t xml:space="preserve">and SH </w:t>
-      </w:r>
-      <w:r>
-        <w:rPr>
-          <w:rFonts w:ascii="Times New Roman" w:hAnsi="Times New Roman" w:cs="Times New Roman"/>
-        </w:rPr>
-        <w:t>implemented the software. TJD provided the biological samples and performed the laboratory experiments. TS analysed the case-study data. TS wrote the first draft. All authors reviewed and edited the manuscript and approved the final version.</w:t>
+        <w:t xml:space="preserve">TS and MGL conceived the project. TS and SH implemented the software. TJD provided the biological samples and performed the laboratory experiments. TS analysed the case-study data. TS wrote the first draft. All authors reviewed and edited the manuscript and approved the final version.</w:t>
       </w:r>
     </w:p>
     <w:p>
@@ -2480,6 +2278,7 @@
           <w:rFonts w:ascii="Times New Roman" w:hAnsi="Times New Roman" w:cs="Times New Roman"/>
         </w:rPr>
       </w:pPr>
+      <w:commentRangeStart w:id="24"/>
       <w:r>
         <w:rPr>
           <w:rFonts w:ascii="Times New Roman" w:hAnsi="Times New Roman" w:cs="Times New Roman"/>
@@ -2487,24 +2286,39 @@
           <w:szCs w:val="20"/>
           <w:lang w:val="fr-CA"/>
         </w:rPr>
-        <w:t xml:space="preserve">1. </w:t>
+        <w:t xml:space="preserve">1. Charalampous T, Kay GL, Richardson H, Aydin A, Baldan R, Jeanes C, et al. </w:t>
       </w:r>
       <w:r>
         <w:rPr>
           <w:rFonts w:ascii="Times New Roman" w:hAnsi="Times New Roman" w:cs="Times New Roman"/>
           <w:sz w:val="20"/>
           <w:szCs w:val="20"/>
-          <w:lang w:val="fr-CA"/>
-        </w:rPr>
-        <w:t xml:space="preserve">Charalampous T, Kay GL, Richardson H, Aydin A, Baldan R, Jeanes C, et al. </w:t>
-      </w:r>
+        </w:rPr>
+        <w:t>Nanopore metagenomics enables rapid clinical diagnosis of bacterial lower respiratory infection. Nat Biotechnol. 2019;37(7):783-92.</w:t>
+      </w:r>
+      <w:commentRangeEnd w:id="24"/>
+      <w:r>
+        <w:rPr>
+          <w:rStyle w:val="CommentReference"/>
+        </w:rPr>
+        <w:commentReference w:id="24"/>
+      </w:r>
+    </w:p>
+    <w:p>
+      <w:pPr>
+        <w:spacing w:after="80" w:line="300" w:lineRule="auto"/>
+        <w:ind w:left="500" w:hanging="500"/>
+        <w:rPr>
+          <w:rFonts w:ascii="Times New Roman" w:hAnsi="Times New Roman" w:cs="Times New Roman"/>
+        </w:rPr>
+      </w:pPr>
       <w:r>
         <w:rPr>
           <w:rFonts w:ascii="Times New Roman" w:hAnsi="Times New Roman" w:cs="Times New Roman"/>
           <w:sz w:val="20"/>
           <w:szCs w:val="20"/>
         </w:rPr>
-        <w:t>Nanopore metagenomics enables rapid clinical diagnosis of bacterial lower respiratory infection. Nat Biotechnol. 2019;37(7):783-92.</w:t>
+        <w:t>2. Gu W, Deng X, Lee M, Sucu YD, Arevalo S, Stryke D, et al. Rapid pathogen detection by metagenomic next-generation sequencing of infected body fluids. Nat Med. 2021;27(1):115-24.</w:t>
       </w:r>
     </w:p>
     <w:p>
@@ -2521,7 +2335,15 @@
           <w:sz w:val="20"/>
           <w:szCs w:val="20"/>
         </w:rPr>
-        <w:t>2. Gu W, Deng X, Lee M, Sucu YD, Arevalo S, Stryke D, et al. Rapid pathogen detection by metagenomic next-generation sequencing of infected body fluids. Nat Med. 2021;27(1):115-24.</w:t>
+        <w:t xml:space="preserve">3. </w:t>
+      </w:r>
+      <w:r>
+        <w:rPr>
+          <w:rFonts w:ascii="Times New Roman" w:hAnsi="Times New Roman" w:cs="Times New Roman"/>
+          <w:sz w:val="20"/>
+          <w:szCs w:val="20"/>
+        </w:rPr>
+        <w:t xml:space="preserve">Sung YH, Ju YK, Lee HJ, et al. Clinical performance of real-time nanopore metagenomic sequencing for rapid identification of bacterial pathogens in cerebrospinal fluid: a pilot study. Sci Rep. 2025;15:3493.</w:t>
       </w:r>
     </w:p>
     <w:p>
@@ -2538,7 +2360,15 @@
           <w:sz w:val="20"/>
           <w:szCs w:val="20"/>
         </w:rPr>
-        <w:t xml:space="preserve">3. Harper SJ, Ward LI, Clover GRG. Development of LAMP and real-time PCR methods for the rapid detection of </w:t>
+        <w:t xml:space="preserve">4. </w:t>
+      </w:r>
+      <w:r>
+        <w:rPr>
+          <w:rFonts w:ascii="Times New Roman" w:hAnsi="Times New Roman" w:cs="Times New Roman"/>
+          <w:sz w:val="20"/>
+          <w:szCs w:val="20"/>
+        </w:rPr>
+        <w:t xml:space="preserve">EPPO. PM 7/24 (5) </w:t>
       </w:r>
       <w:r>
         <w:rPr>
@@ -2548,7 +2378,7 @@
           <w:sz w:val="20"/>
           <w:szCs w:val="20"/>
         </w:rPr>
-        <w:t>Xylella fastidiosa</w:t>
+        <w:t xml:space="preserve">Xylella fastidiosa</w:t>
       </w:r>
       <w:r>
         <w:rPr>
@@ -2556,7 +2386,7 @@
           <w:sz w:val="20"/>
           <w:szCs w:val="20"/>
         </w:rPr>
-        <w:t xml:space="preserve"> for quarantine and field applications. Phytopathology. 2010;100(12):1282-8.</w:t>
+        <w:t xml:space="preserve">. EPPO Bull. 2023;53(2):205-76.</w:t>
       </w:r>
     </w:p>
     <w:p>
@@ -2565,7 +2395,6 @@
         <w:ind w:left="500" w:hanging="500"/>
         <w:rPr>
           <w:rFonts w:ascii="Times New Roman" w:hAnsi="Times New Roman" w:cs="Times New Roman"/>
-          <w:lang w:val="fr-CA"/>
         </w:rPr>
       </w:pPr>
       <w:r>
@@ -2574,7 +2403,15 @@
           <w:sz w:val="20"/>
           <w:szCs w:val="20"/>
         </w:rPr>
-        <w:t xml:space="preserve">4. Probert WS, Schrader KN, Khuong NY, Bystrom SL, Graves MH. Real-time multiplex PCR assay for detection of </w:t>
+        <w:t xml:space="preserve">5. </w:t>
+      </w:r>
+      <w:r>
+        <w:rPr>
+          <w:rFonts w:ascii="Times New Roman" w:hAnsi="Times New Roman" w:cs="Times New Roman"/>
+          <w:sz w:val="20"/>
+          <w:szCs w:val="20"/>
+        </w:rPr>
+        <w:t xml:space="preserve">WOAH. Brucellosis (infection with </w:t>
       </w:r>
       <w:r>
         <w:rPr>
@@ -2584,7 +2421,7 @@
           <w:sz w:val="20"/>
           <w:szCs w:val="20"/>
         </w:rPr>
-        <w:t>Brucella spp.</w:t>
+        <w:t xml:space="preserve">Brucella abortus</w:t>
       </w:r>
       <w:r>
         <w:rPr>
@@ -2602,7 +2439,7 @@
           <w:sz w:val="20"/>
           <w:szCs w:val="20"/>
         </w:rPr>
-        <w:t>B. abortus</w:t>
+        <w:t xml:space="preserve">B. melitensis</w:t>
       </w:r>
       <w:r>
         <w:rPr>
@@ -2610,7 +2447,7 @@
           <w:sz w:val="20"/>
           <w:szCs w:val="20"/>
         </w:rPr>
-        <w:t xml:space="preserve">, and </w:t>
+        <w:t xml:space="preserve"> and </w:t>
       </w:r>
       <w:r>
         <w:rPr>
@@ -2620,7 +2457,7 @@
           <w:sz w:val="20"/>
           <w:szCs w:val="20"/>
         </w:rPr>
-        <w:t>B. melitensis</w:t>
+        <w:t xml:space="preserve">B. suis</w:t>
       </w:r>
       <w:r>
         <w:rPr>
@@ -2628,8 +2465,67 @@
           <w:sz w:val="20"/>
           <w:szCs w:val="20"/>
         </w:rPr>
-        <w:t xml:space="preserve">. </w:t>
-      </w:r>
+        <w:t xml:space="preserve">). Chapter 3.1.4. In: Manual of Diagnostic Tests and Vaccines for Terrestrial Animals. Paris: World Organisation for Animal Health; 2022.</w:t>
+      </w:r>
+    </w:p>
+    <w:p>
+      <w:pPr>
+        <w:spacing w:after="80" w:line="300" w:lineRule="auto"/>
+        <w:ind w:left="500" w:hanging="500"/>
+        <w:rPr>
+          <w:rFonts w:ascii="Times New Roman" w:hAnsi="Times New Roman" w:cs="Times New Roman"/>
+        </w:rPr>
+      </w:pPr>
+      <w:r>
+        <w:rPr>
+          <w:rFonts w:ascii="Times New Roman" w:hAnsi="Times New Roman" w:cs="Times New Roman"/>
+          <w:sz w:val="20"/>
+          <w:szCs w:val="20"/>
+        </w:rPr>
+        <w:t xml:space="preserve">6. </w:t>
+      </w:r>
+      <w:r>
+        <w:rPr>
+          <w:rFonts w:ascii="Times New Roman" w:hAnsi="Times New Roman" w:cs="Times New Roman"/>
+          <w:sz w:val="20"/>
+          <w:szCs w:val="20"/>
+        </w:rPr>
+        <w:t xml:space="preserve">Wang X, Liang S, Gan Q, Cai B, Liu C. Current status and future perspectives of the diagnostic of plant bacterial pathogens. Front Plant Sci. 2025;16:1547974.</w:t>
+      </w:r>
+    </w:p>
+    <w:p>
+      <w:pPr>
+        <w:spacing w:after="80" w:line="300" w:lineRule="auto"/>
+        <w:ind w:left="500" w:hanging="500"/>
+        <w:rPr>
+          <w:rFonts w:ascii="Times New Roman" w:hAnsi="Times New Roman" w:cs="Times New Roman"/>
+        </w:rPr>
+      </w:pPr>
+      <w:r>
+        <w:rPr>
+          <w:rFonts w:ascii="Times New Roman" w:hAnsi="Times New Roman" w:cs="Times New Roman"/>
+          <w:sz w:val="20"/>
+          <w:szCs w:val="20"/>
+        </w:rPr>
+        <w:t xml:space="preserve">7. </w:t>
+      </w:r>
+      <w:r>
+        <w:rPr>
+          <w:rFonts w:ascii="Times New Roman" w:hAnsi="Times New Roman" w:cs="Times New Roman"/>
+          <w:sz w:val="20"/>
+          <w:szCs w:val="20"/>
+        </w:rPr>
+        <w:t xml:space="preserve">Qureshi KA, Parvez A, Fahmy NA, Abdel Hady BH, Kumar S, Ganguly A, et al. Brucellosis: epidemiology, pathogenesis, diagnosis and treatment, a comprehensive review. Ann Med. 2023;55(2):2295398.</w:t>
+      </w:r>
+    </w:p>
+    <w:p>
+      <w:pPr>
+        <w:spacing w:after="80" w:line="300" w:lineRule="auto"/>
+        <w:ind w:left="500" w:hanging="500"/>
+        <w:rPr>
+          <w:rFonts w:ascii="Times New Roman" w:hAnsi="Times New Roman" w:cs="Times New Roman"/>
+        </w:rPr>
+      </w:pPr>
       <w:r>
         <w:rPr>
           <w:rFonts w:ascii="Times New Roman" w:hAnsi="Times New Roman" w:cs="Times New Roman"/>
@@ -2637,25 +2533,7 @@
           <w:szCs w:val="20"/>
           <w:lang w:val="fr-CA"/>
         </w:rPr>
-        <w:t>J Clin Microbiol. 2004;42(3):1290-3.</w:t>
-      </w:r>
-    </w:p>
-    <w:p>
-      <w:pPr>
-        <w:spacing w:after="80" w:line="300" w:lineRule="auto"/>
-        <w:ind w:left="500" w:hanging="500"/>
-        <w:rPr>
-          <w:rFonts w:ascii="Times New Roman" w:hAnsi="Times New Roman" w:cs="Times New Roman"/>
-        </w:rPr>
-      </w:pPr>
-      <w:r>
-        <w:rPr>
-          <w:rFonts w:ascii="Times New Roman" w:hAnsi="Times New Roman" w:cs="Times New Roman"/>
-          <w:sz w:val="20"/>
-          <w:szCs w:val="20"/>
-          <w:lang w:val="fr-CA"/>
-        </w:rPr>
-        <w:t xml:space="preserve">5. Faino L, Scala V, Albanese A, Modesti V, Grottoli A, Pucci N, et al. </w:t>
+        <w:t xml:space="preserve">8. Faino L, Scala V, Albanese A, Modesti V, Grottoli A, Pucci N, et al. </w:t>
       </w:r>
       <w:r>
         <w:rPr>
@@ -2699,7 +2577,7 @@
           <w:szCs w:val="20"/>
         </w:rPr>
         <w:lastRenderedPageBreak/>
-        <w:t>6. Oxford Nanopore Technologies. MinKNOW and EPI2ME documentation. https://nanoporetech.com/document/experiment-companion-minknow and https://epi2me.nanoporetech.com/. Accessed [date].</w:t>
+        <w:t>9. Oxford Nanopore Technologies. MinKNOW and EPI2ME documentation. https://nanoporetech.com/document/experiment-companion-minknow and https://epi2me.nanoporetech.com/. Accessed [date].</w:t>
       </w:r>
     </w:p>
     <w:p>
@@ -2716,7 +2594,7 @@
           <w:sz w:val="20"/>
           <w:szCs w:val="20"/>
         </w:rPr>
-        <w:t>7. ARTIC Network. RAMPART: Read Assignment, Mapping, and Phylogenetic Analysis in Real Time. https://github.com/artic-network/rampart. Accessed [date].</w:t>
+        <w:t>10. ARTIC Network. RAMPART: Read Assignment, Mapping, and Phylogenetic Analysis in Real Time. https://github.com/artic-network/rampart. Accessed [date].</w:t>
       </w:r>
     </w:p>
     <w:p>
@@ -2733,15 +2611,24 @@
           <w:sz w:val="20"/>
           <w:szCs w:val="20"/>
         </w:rPr>
-        <w:t xml:space="preserve">8. </w:t>
-      </w:r>
+        <w:t xml:space="preserve">11. Munro R, Santos R, Payne A, Forey T, Osei S, Holmes N, et al. minoTour, real-time monitoring and analysis for nanopore sequencers. Bioinformatics. 2022;38(4):1133-5.</w:t>
+      </w:r>
+    </w:p>
+    <w:p>
+      <w:pPr>
+        <w:spacing w:after="80" w:line="300" w:lineRule="auto"/>
+        <w:ind w:left="500" w:hanging="500"/>
+        <w:rPr>
+          <w:rFonts w:ascii="Times New Roman" w:hAnsi="Times New Roman" w:cs="Times New Roman"/>
+        </w:rPr>
+      </w:pPr>
       <w:r>
         <w:rPr>
           <w:rFonts w:ascii="Times New Roman" w:hAnsi="Times New Roman" w:cs="Times New Roman"/>
           <w:sz w:val="20"/>
           <w:szCs w:val="20"/>
         </w:rPr>
-        <w:t>Munro R, Santos R, Payne A, Forey T, Osei S, Holmes N, et al. minoTour, real-time monitoring and analysis for nanopore sequencers. Bioinformatics. 2022;38(4):1133-5.</w:t>
+        <w:t>12. Bruno A, Aury JM, Engelen S. BoardION: real-time monitoring of Oxford Nanopore sequencing instruments. BMC Bioinformatics. 2021;22(1):245.</w:t>
       </w:r>
     </w:p>
     <w:p>
@@ -2758,7 +2645,7 @@
           <w:sz w:val="20"/>
           <w:szCs w:val="20"/>
         </w:rPr>
-        <w:t>9. Bruno A, Aury JM, Engelen S. BoardION: real-time monitoring of Oxford Nanopore sequencing instruments. BMC Bioinformatics. 2021;22(1):245.</w:t>
+        <w:t>13. Peel N, Martin S, Heavens D, Yu DW, Clark MD, Leggett RM. Real-time analysis and visualization of nanopore metagenomic samples with MARTi. Genome Res. 2025;35(11):2488-[end page].</w:t>
       </w:r>
     </w:p>
     <w:p>
@@ -2775,7 +2662,7 @@
           <w:sz w:val="20"/>
           <w:szCs w:val="20"/>
         </w:rPr>
-        <w:t>10. Peel N, Martin S, Heavens D, Yu DW, Clark MD, Leggett RM. Real-time analysis and visualization of nanopore metagenomic samples with MARTi. Genome Res. 2025;35(11):2488-[end page].</w:t>
+        <w:t xml:space="preserve">14. Sandås K, Lewerentz J, Karlsson E, Karlsson L, Sundell D, Simonyté-Sjödin K, et al. Nanometa Live: a user-friendly application for real-time metagenomic data analysis and pathogen identification. Bioinformatics. 2024;40(3):btae108.</w:t>
       </w:r>
     </w:p>
     <w:p>
@@ -2792,15 +2679,24 @@
           <w:sz w:val="20"/>
           <w:szCs w:val="20"/>
         </w:rPr>
-        <w:t xml:space="preserve">11. </w:t>
-      </w:r>
+        <w:t>15. Leggett RM, Alcon-Giner C, Heavens D, Caim S, Brook TC, Kujawska M, et al. Rapid MinION profiling of preterm microbiota and antimicrobial-resistant pathogens. Nat Microbiol. 2020;5(3):430-42.</w:t>
+      </w:r>
+    </w:p>
+    <w:p>
+      <w:pPr>
+        <w:spacing w:after="80" w:line="300" w:lineRule="auto"/>
+        <w:ind w:left="500" w:hanging="500"/>
+        <w:rPr>
+          <w:rFonts w:ascii="Times New Roman" w:hAnsi="Times New Roman" w:cs="Times New Roman"/>
+        </w:rPr>
+      </w:pPr>
       <w:r>
         <w:rPr>
           <w:rFonts w:ascii="Times New Roman" w:hAnsi="Times New Roman" w:cs="Times New Roman"/>
           <w:sz w:val="20"/>
           <w:szCs w:val="20"/>
         </w:rPr>
-        <w:t>Sandås K, Lewerentz J, Karlsson E, Karlsson L, Sundell D, Simonyté-Sjödin K, et al. Nanometa Live: a user-friendly application for real-time metagenomic data analysis and pathogen identification. Bioinformatics. 2024;40(3):btae108.</w:t>
+        <w:t xml:space="preserve">16. Fan J, Huang S, Chorlton SD. BugSeq: a highly accurate cloud platform for long-read metagenomic analyses. BMC Bioinformatics. 2021;22(1):160.</w:t>
       </w:r>
     </w:p>
     <w:p>
@@ -2817,7 +2713,7 @@
           <w:sz w:val="20"/>
           <w:szCs w:val="20"/>
         </w:rPr>
-        <w:t>12. Leggett RM, Alcon-Giner C, Heavens D, Caim S, Brook TC, Kujawska M, et al. Rapid MinION profiling of preterm microbiota and antimicrobial-resistant pathogens. Nat Microbiol. 2020;5(3):430-42.</w:t>
+        <w:t>17. Chen S, He C, Li Y, Li Z, Melançon CE. A computational toolset for rapid identification of SARS-CoV-2, other viruses and microorganisms from sequencing data. Brief Bioinform. 2021;22(2):924-35.</w:t>
       </w:r>
     </w:p>
     <w:p>
@@ -2834,15 +2730,24 @@
           <w:sz w:val="20"/>
           <w:szCs w:val="20"/>
         </w:rPr>
-        <w:t xml:space="preserve">13. </w:t>
-      </w:r>
+        <w:t xml:space="preserve">18. Clarke EL, Taylor LJ, Zhao C, Connell A, Lee JJ, Fett B, et al. Sunbeam: an extensible pipeline for analyzing metagenomic sequencing experiments. Microbiome. 2019;7(1):46.</w:t>
+      </w:r>
+    </w:p>
+    <w:p>
+      <w:pPr>
+        <w:spacing w:after="80" w:line="300" w:lineRule="auto"/>
+        <w:ind w:left="500" w:hanging="500"/>
+        <w:rPr>
+          <w:rFonts w:ascii="Times New Roman" w:hAnsi="Times New Roman" w:cs="Times New Roman"/>
+        </w:rPr>
+      </w:pPr>
       <w:r>
         <w:rPr>
           <w:rFonts w:ascii="Times New Roman" w:hAnsi="Times New Roman" w:cs="Times New Roman"/>
           <w:sz w:val="20"/>
           <w:szCs w:val="20"/>
         </w:rPr>
-        <w:t>Fan J, Huang S, Chorlton SD. BugSeq: a highly accurate cloud platform for long-read metagenomic analyses. BMC Bioinformatics. 2021;22(1):160.</w:t>
+        <w:t>19. Payne A, Holmes N, Clarke T, Munro R, Debebe BJ, Loose M. Readfish enables targeted nanopore sequencing of gigabase-sized genomes. Nat Biotechnol. 2021;39(4):442-50.</w:t>
       </w:r>
     </w:p>
     <w:p>
@@ -2859,7 +2764,7 @@
           <w:sz w:val="20"/>
           <w:szCs w:val="20"/>
         </w:rPr>
-        <w:t>14. Chen S, He C, Li Y, Li Z, Melançon CE. A computational toolset for rapid identification of SARS-CoV-2, other viruses and microorganisms from sequencing data. Brief Bioinform. 2021;22(2):924-35.</w:t>
+        <w:t xml:space="preserve">20. Martin S, Heavens D, Lan Y, Horsfield S, Clark MD, Leggett RM. Nanopore adaptive sampling: a tool for enrichment of low abundance species in metagenomic samples. Genome Biol. 2022;23(1):11.</w:t>
       </w:r>
     </w:p>
     <w:p>
@@ -2876,15 +2781,24 @@
           <w:sz w:val="20"/>
           <w:szCs w:val="20"/>
         </w:rPr>
-        <w:t xml:space="preserve">15. </w:t>
-      </w:r>
+        <w:t>21. Li H. Minimap2: pairwise alignment for nucleotide sequences. Bioinformatics. 2018;34(18):3094-100.</w:t>
+      </w:r>
+    </w:p>
+    <w:p>
+      <w:pPr>
+        <w:spacing w:after="80" w:line="300" w:lineRule="auto"/>
+        <w:ind w:left="500" w:hanging="500"/>
+        <w:rPr>
+          <w:rFonts w:ascii="Times New Roman" w:hAnsi="Times New Roman" w:cs="Times New Roman"/>
+        </w:rPr>
+      </w:pPr>
       <w:r>
         <w:rPr>
           <w:rFonts w:ascii="Times New Roman" w:hAnsi="Times New Roman" w:cs="Times New Roman"/>
           <w:sz w:val="20"/>
           <w:szCs w:val="20"/>
         </w:rPr>
-        <w:t>Clarke EL, Taylor LJ, Zhao C, Connell A, Lee JJ, Fett B, et al. Sunbeam: an extensible pipeline for analyzing metagenomic sequencing experiments. Microbiome. 2019;7(1):46.</w:t>
+        <w:t>22. Danecek P, Bonfield JK, Liddle J, Marshall J, Ohan V, Pollard MO, et al. Twelve years of SAMtools and BCFtools. Gigascience. 2021;10(2):giab008.</w:t>
       </w:r>
     </w:p>
     <w:p>
@@ -2901,7 +2815,7 @@
           <w:sz w:val="20"/>
           <w:szCs w:val="20"/>
         </w:rPr>
-        <w:t>16. Payne A, Holmes N, Clarke T, Munro R, Debebe BJ, Loose M. Readfish enables targeted nanopore sequencing of gigabase-sized genomes. Nat Biotechnol. 2021;39(4):442-50.</w:t>
+        <w:t xml:space="preserve">23. Wood DE, Lu J, Langmead B. Improved metagenomic analysis with Kraken 2. Genome Biol. 2019;20(1):257.</w:t>
       </w:r>
     </w:p>
     <w:p>
@@ -2918,15 +2832,24 @@
           <w:sz w:val="20"/>
           <w:szCs w:val="20"/>
         </w:rPr>
-        <w:t xml:space="preserve">17. </w:t>
-      </w:r>
+        <w:t>24. Kim D, Song L, Breitwieser FP, Salzberg SL. Centrifuge: rapid and sensitive classification of metagenomic sequences. Genome Res. 2016;26(12):1721-9.</w:t>
+      </w:r>
+    </w:p>
+    <w:p>
+      <w:pPr>
+        <w:spacing w:after="80" w:line="300" w:lineRule="auto"/>
+        <w:ind w:left="500" w:hanging="500"/>
+        <w:rPr>
+          <w:rFonts w:ascii="Times New Roman" w:hAnsi="Times New Roman" w:cs="Times New Roman"/>
+        </w:rPr>
+      </w:pPr>
       <w:r>
         <w:rPr>
           <w:rFonts w:ascii="Times New Roman" w:hAnsi="Times New Roman" w:cs="Times New Roman"/>
           <w:sz w:val="20"/>
           <w:szCs w:val="20"/>
         </w:rPr>
-        <w:t>Martin S, Heavens D, Lan Y, Horsfield S, Clark MD, Leggett RM. Nanopore adaptive sampling: a tool for enrichment of low abundance species in metagenomic samples. Genome Biol. 2022;23(1):11.</w:t>
+        <w:t>25. De Coster W, D'Hert S, Schultz DT, Cruts M, Van Broeckhoven C. NanoPack: visualizing and processing long-read sequencing data. Bioinformatics. 2018;34(15):2666-9.</w:t>
       </w:r>
     </w:p>
     <w:p>
@@ -2943,7 +2866,7 @@
           <w:sz w:val="20"/>
           <w:szCs w:val="20"/>
         </w:rPr>
-        <w:t>18. Li H. Minimap2: pairwise alignment for nucleotide sequences. Bioinformatics. 2018;34(18):3094-100.</w:t>
+        <w:t xml:space="preserve">26. Leger A, Leonardi T. pycoQC, interactive quality control for Oxford Nanopore Sequencing. J Open Source Softw. 2019;4(34):1236.</w:t>
       </w:r>
     </w:p>
     <w:p>
@@ -2960,7 +2883,7 @@
           <w:sz w:val="20"/>
           <w:szCs w:val="20"/>
         </w:rPr>
-        <w:t>19. Danecek P, Bonfield JK, Liddle J, Marshall J, Ohan V, Pollard MO, et al. Twelve years of SAMtools and BCFtools. Gigascience. 2021;10(2):giab008.</w:t>
+        <w:t>27. Wilson EB. Probable inference, the law of succession, and statistical inference. J Am Stat Assoc. 1927;22(158):209-12.</w:t>
       </w:r>
     </w:p>
     <w:p>
@@ -2977,126 +2900,24 @@
           <w:sz w:val="20"/>
           <w:szCs w:val="20"/>
         </w:rPr>
-        <w:t xml:space="preserve">20. </w:t>
-      </w:r>
+        <w:t>28. Cohen J. A coefficient of agreement for nominal scales. Educ Psychol Meas. 1960;20(1):37-46.</w:t>
+      </w:r>
+    </w:p>
+    <w:p>
+      <w:pPr>
+        <w:spacing w:after="80" w:line="300" w:lineRule="auto"/>
+        <w:ind w:left="500" w:hanging="500"/>
+        <w:rPr>
+          <w:rFonts w:ascii="Times New Roman" w:hAnsi="Times New Roman" w:cs="Times New Roman"/>
+        </w:rPr>
+      </w:pPr>
       <w:r>
         <w:rPr>
           <w:rFonts w:ascii="Times New Roman" w:hAnsi="Times New Roman" w:cs="Times New Roman"/>
           <w:sz w:val="20"/>
           <w:szCs w:val="20"/>
         </w:rPr>
-        <w:t>Wood DE, Lu J, Langmead B. Improved metagenomic analysis with Kraken 2. Genome Biol. 2019;20(1):257.</w:t>
-      </w:r>
-    </w:p>
-    <w:p>
-      <w:pPr>
-        <w:spacing w:after="80" w:line="300" w:lineRule="auto"/>
-        <w:ind w:left="500" w:hanging="500"/>
-        <w:rPr>
-          <w:rFonts w:ascii="Times New Roman" w:hAnsi="Times New Roman" w:cs="Times New Roman"/>
-        </w:rPr>
-      </w:pPr>
-      <w:r>
-        <w:rPr>
-          <w:rFonts w:ascii="Times New Roman" w:hAnsi="Times New Roman" w:cs="Times New Roman"/>
-          <w:sz w:val="20"/>
-          <w:szCs w:val="20"/>
-        </w:rPr>
-        <w:t>21. Kim D, Song L, Breitwieser FP, Salzberg SL. Centrifuge: rapid and sensitive classification of metagenomic sequences. Genome Res. 2016;26(12):1721-9.</w:t>
-      </w:r>
-    </w:p>
-    <w:p>
-      <w:pPr>
-        <w:spacing w:after="80" w:line="300" w:lineRule="auto"/>
-        <w:ind w:left="500" w:hanging="500"/>
-        <w:rPr>
-          <w:rFonts w:ascii="Times New Roman" w:hAnsi="Times New Roman" w:cs="Times New Roman"/>
-        </w:rPr>
-      </w:pPr>
-      <w:r>
-        <w:rPr>
-          <w:rFonts w:ascii="Times New Roman" w:hAnsi="Times New Roman" w:cs="Times New Roman"/>
-          <w:sz w:val="20"/>
-          <w:szCs w:val="20"/>
-        </w:rPr>
-        <w:t>22. De Coster W, D'Hert S, Schultz DT, Cruts M, Van Broeckhoven C. NanoPack: visualizing and processing long-read sequencing data. Bioinformatics. 2018;34(15):2666-9.</w:t>
-      </w:r>
-    </w:p>
-    <w:p>
-      <w:pPr>
-        <w:spacing w:after="80" w:line="300" w:lineRule="auto"/>
-        <w:ind w:left="500" w:hanging="500"/>
-        <w:rPr>
-          <w:rFonts w:ascii="Times New Roman" w:hAnsi="Times New Roman" w:cs="Times New Roman"/>
-        </w:rPr>
-      </w:pPr>
-      <w:r>
-        <w:rPr>
-          <w:rFonts w:ascii="Times New Roman" w:hAnsi="Times New Roman" w:cs="Times New Roman"/>
-          <w:sz w:val="20"/>
-          <w:szCs w:val="20"/>
-        </w:rPr>
-        <w:t xml:space="preserve">23. </w:t>
-      </w:r>
-      <w:r>
-        <w:rPr>
-          <w:rFonts w:ascii="Times New Roman" w:hAnsi="Times New Roman" w:cs="Times New Roman"/>
-          <w:sz w:val="20"/>
-          <w:szCs w:val="20"/>
-        </w:rPr>
-        <w:t>Leger A, Leonardi T. pycoQC, interactive quality control for Oxford Nanopore Sequencing. J Open Source Softw. 2019;4(34):1236.</w:t>
-      </w:r>
-    </w:p>
-    <w:p>
-      <w:pPr>
-        <w:spacing w:after="80" w:line="300" w:lineRule="auto"/>
-        <w:ind w:left="500" w:hanging="500"/>
-        <w:rPr>
-          <w:rFonts w:ascii="Times New Roman" w:hAnsi="Times New Roman" w:cs="Times New Roman"/>
-        </w:rPr>
-      </w:pPr>
-      <w:r>
-        <w:rPr>
-          <w:rFonts w:ascii="Times New Roman" w:hAnsi="Times New Roman" w:cs="Times New Roman"/>
-          <w:sz w:val="20"/>
-          <w:szCs w:val="20"/>
-        </w:rPr>
-        <w:t>24. Wilson EB. Probable inference, the law of succession, and statistical inference. J Am Stat Assoc. 1927;22(158):209-12.</w:t>
-      </w:r>
-    </w:p>
-    <w:p>
-      <w:pPr>
-        <w:spacing w:after="80" w:line="300" w:lineRule="auto"/>
-        <w:ind w:left="500" w:hanging="500"/>
-        <w:rPr>
-          <w:rFonts w:ascii="Times New Roman" w:hAnsi="Times New Roman" w:cs="Times New Roman"/>
-        </w:rPr>
-      </w:pPr>
-      <w:r>
-        <w:rPr>
-          <w:rFonts w:ascii="Times New Roman" w:hAnsi="Times New Roman" w:cs="Times New Roman"/>
-          <w:sz w:val="20"/>
-          <w:szCs w:val="20"/>
-        </w:rPr>
-        <w:t>25. Cohen J. A coefficient of agreement for nominal scales. Educ Psychol Meas. 1960;20(1):37-46.</w:t>
-      </w:r>
-    </w:p>
-    <w:p>
-      <w:pPr>
-        <w:spacing w:after="80" w:line="300" w:lineRule="auto"/>
-        <w:ind w:left="500" w:hanging="500"/>
-        <w:rPr>
-          <w:rFonts w:ascii="Times New Roman" w:hAnsi="Times New Roman" w:cs="Times New Roman"/>
-        </w:rPr>
-      </w:pPr>
-      <w:r>
-        <w:rPr>
-          <w:rFonts w:ascii="Times New Roman" w:hAnsi="Times New Roman" w:cs="Times New Roman"/>
-          <w:sz w:val="20"/>
-          <w:szCs w:val="20"/>
-        </w:rPr>
-        <w:lastRenderedPageBreak/>
-        <w:t xml:space="preserve">26. Sicard A, Zeilinger AR, Vanhove M, Schartel TE, Beal DJ, Daugherty MP, et al. </w:t>
+        <w:t xml:space="preserve">29. Harper SJ, Ward LI, Clover GRG. Development of LAMP and real-time PCR methods for the rapid detection of </w:t>
       </w:r>
       <w:r>
         <w:rPr>
@@ -3114,7 +2935,7 @@
           <w:sz w:val="20"/>
           <w:szCs w:val="20"/>
         </w:rPr>
-        <w:t>: insights into an emerging plant pathogen. Annu Rev Phytopathol. 2018;56:181-202.</w:t>
+        <w:t xml:space="preserve"> for quarantine and field applications. Phytopathology. 2010;100(12):1282-8.</w:t>
       </w:r>
     </w:p>
     <w:p>
@@ -3131,7 +2952,218 @@
           <w:sz w:val="20"/>
           <w:szCs w:val="20"/>
         </w:rPr>
-        <w:t>27. Olsen SC, Palmer MV. Advancement of knowledge of Brucella over the past 50 years. Vet Pathol. 2014;51(6):1076-89.</w:t>
+        <w:lastRenderedPageBreak/>
+        <w:t xml:space="preserve">30. Sicard A, Zeilinger AR, Vanhove M, Schartel TE, Beal DJ, Daugherty MP, et al. </w:t>
+      </w:r>
+      <w:r>
+        <w:rPr>
+          <w:rFonts w:ascii="Times New Roman" w:hAnsi="Times New Roman" w:cs="Times New Roman"/>
+          <w:i/>
+          <w:iCs/>
+          <w:sz w:val="20"/>
+          <w:szCs w:val="20"/>
+        </w:rPr>
+        <w:t>Xylella fastidiosa</w:t>
+      </w:r>
+      <w:r>
+        <w:rPr>
+          <w:rFonts w:ascii="Times New Roman" w:hAnsi="Times New Roman" w:cs="Times New Roman"/>
+          <w:sz w:val="20"/>
+          <w:szCs w:val="20"/>
+        </w:rPr>
+        <w:t>: insights into an emerging plant pathogen. Annu Rev Phytopathol. 2018;56:181-202.</w:t>
+      </w:r>
+    </w:p>
+    <w:p>
+      <w:pPr>
+        <w:spacing w:after="80" w:line="300" w:lineRule="auto"/>
+        <w:ind w:left="500" w:hanging="500"/>
+        <w:rPr>
+          <w:rFonts w:ascii="Times New Roman" w:hAnsi="Times New Roman" w:cs="Times New Roman"/>
+        </w:rPr>
+      </w:pPr>
+      <w:r>
+        <w:rPr>
+          <w:rFonts w:ascii="Times New Roman" w:hAnsi="Times New Roman" w:cs="Times New Roman"/>
+          <w:sz w:val="20"/>
+          <w:szCs w:val="20"/>
+        </w:rPr>
+        <w:t xml:space="preserve">31. </w:t>
+      </w:r>
+      <w:r>
+        <w:rPr>
+          <w:rFonts w:ascii="Times New Roman" w:hAnsi="Times New Roman" w:cs="Times New Roman"/>
+          <w:sz w:val="20"/>
+          <w:szCs w:val="20"/>
+        </w:rPr>
+        <w:t xml:space="preserve">Johnson MA, Liu H, Bush E, Sharma P, Yang S, Mazloom R, et al. Investigating plant disease outbreaks with long-read metagenomics: sensitive detection and highly resolved phylogenetic reconstruction applied to </w:t>
+      </w:r>
+      <w:r>
+        <w:rPr>
+          <w:rFonts w:ascii="Times New Roman" w:hAnsi="Times New Roman" w:cs="Times New Roman"/>
+          <w:i/>
+          <w:iCs/>
+          <w:sz w:val="20"/>
+          <w:szCs w:val="20"/>
+        </w:rPr>
+        <w:t xml:space="preserve">Xylella fastidiosa</w:t>
+      </w:r>
+      <w:r>
+        <w:rPr>
+          <w:rFonts w:ascii="Times New Roman" w:hAnsi="Times New Roman" w:cs="Times New Roman"/>
+          <w:sz w:val="20"/>
+          <w:szCs w:val="20"/>
+        </w:rPr>
+        <w:t xml:space="preserve">. Microb Genom. 2022;8(5):000822.</w:t>
+      </w:r>
+    </w:p>
+    <w:p>
+      <w:pPr>
+        <w:spacing w:after="80" w:line="300" w:lineRule="auto"/>
+        <w:ind w:left="500" w:hanging="500"/>
+        <w:rPr>
+          <w:rFonts w:ascii="Times New Roman" w:hAnsi="Times New Roman" w:cs="Times New Roman"/>
+        </w:rPr>
+      </w:pPr>
+      <w:r>
+        <w:rPr>
+          <w:rFonts w:ascii="Times New Roman" w:hAnsi="Times New Roman" w:cs="Times New Roman"/>
+          <w:sz w:val="20"/>
+          <w:szCs w:val="20"/>
+        </w:rPr>
+        <w:t xml:space="preserve">32. </w:t>
+      </w:r>
+      <w:r>
+        <w:rPr>
+          <w:rFonts w:ascii="Times New Roman" w:hAnsi="Times New Roman" w:cs="Times New Roman"/>
+          <w:sz w:val="20"/>
+          <w:szCs w:val="20"/>
+        </w:rPr>
+        <w:t xml:space="preserve">Xue T, Zhang B, Wang Z, Ma Y, Shen Q, Ding J, et al. Rapid metagenomic detection of </w:t>
+      </w:r>
+      <w:r>
+        <w:rPr>
+          <w:rFonts w:ascii="Times New Roman" w:hAnsi="Times New Roman" w:cs="Times New Roman"/>
+          <w:i/>
+          <w:iCs/>
+          <w:sz w:val="20"/>
+          <w:szCs w:val="20"/>
+        </w:rPr>
+        <w:t xml:space="preserve">Brucella abortus</w:t>
+      </w:r>
+      <w:r>
+        <w:rPr>
+          <w:rFonts w:ascii="Times New Roman" w:hAnsi="Times New Roman" w:cs="Times New Roman"/>
+          <w:sz w:val="20"/>
+          <w:szCs w:val="20"/>
+        </w:rPr>
+        <w:t xml:space="preserve"> during a two-case bovine abortion investigation in Inner Mongolia, China. Vet Sci. 2026;13(6):541.</w:t>
+      </w:r>
+    </w:p>
+    <w:p>
+      <w:pPr>
+        <w:spacing w:after="80" w:line="300" w:lineRule="auto"/>
+        <w:ind w:left="500" w:hanging="500"/>
+        <w:rPr>
+          <w:rFonts w:ascii="Times New Roman" w:hAnsi="Times New Roman" w:cs="Times New Roman"/>
+        </w:rPr>
+      </w:pPr>
+      <w:r>
+        <w:rPr>
+          <w:rFonts w:ascii="Times New Roman" w:hAnsi="Times New Roman" w:cs="Times New Roman"/>
+          <w:sz w:val="20"/>
+          <w:szCs w:val="20"/>
+        </w:rPr>
+        <w:t xml:space="preserve">33. </w:t>
+      </w:r>
+      <w:r>
+        <w:rPr>
+          <w:rFonts w:ascii="Times New Roman" w:hAnsi="Times New Roman" w:cs="Times New Roman"/>
+          <w:sz w:val="20"/>
+          <w:szCs w:val="20"/>
+        </w:rPr>
+        <w:t xml:space="preserve">Yang L, Lin Y, Li P, et al. A comprehensive benchmarking of adaptive sampling tools for nanopore sequencing. Genome Biol. 2025;26:281.</w:t>
+      </w:r>
+    </w:p>
+    <w:p>
+      <w:pPr>
+        <w:spacing w:after="80" w:line="300" w:lineRule="auto"/>
+        <w:ind w:left="500" w:hanging="500"/>
+        <w:rPr>
+          <w:rFonts w:ascii="Times New Roman" w:hAnsi="Times New Roman" w:cs="Times New Roman"/>
+          <w:lang w:val="fr-CA"/>
+        </w:rPr>
+      </w:pPr>
+      <w:r>
+        <w:rPr>
+          <w:rFonts w:ascii="Times New Roman" w:hAnsi="Times New Roman" w:cs="Times New Roman"/>
+          <w:sz w:val="20"/>
+          <w:szCs w:val="20"/>
+        </w:rPr>
+        <w:t xml:space="preserve">34. Probert WS, Schrader KN, Khuong NY, Bystrom SL, Graves MH. Real-time multiplex PCR assay for detection of </w:t>
+      </w:r>
+      <w:r>
+        <w:rPr>
+          <w:rFonts w:ascii="Times New Roman" w:hAnsi="Times New Roman" w:cs="Times New Roman"/>
+          <w:i/>
+          <w:iCs/>
+          <w:sz w:val="20"/>
+          <w:szCs w:val="20"/>
+        </w:rPr>
+        <w:t>Brucella spp.</w:t>
+      </w:r>
+      <w:r>
+        <w:rPr>
+          <w:rFonts w:ascii="Times New Roman" w:hAnsi="Times New Roman" w:cs="Times New Roman"/>
+          <w:sz w:val="20"/>
+          <w:szCs w:val="20"/>
+        </w:rPr>
+        <w:t xml:space="preserve">, </w:t>
+      </w:r>
+      <w:r>
+        <w:rPr>
+          <w:rFonts w:ascii="Times New Roman" w:hAnsi="Times New Roman" w:cs="Times New Roman"/>
+          <w:i/>
+          <w:iCs/>
+          <w:sz w:val="20"/>
+          <w:szCs w:val="20"/>
+        </w:rPr>
+        <w:t>B. abortus</w:t>
+      </w:r>
+      <w:r>
+        <w:rPr>
+          <w:rFonts w:ascii="Times New Roman" w:hAnsi="Times New Roman" w:cs="Times New Roman"/>
+          <w:sz w:val="20"/>
+          <w:szCs w:val="20"/>
+        </w:rPr>
+        <w:t xml:space="preserve">, and </w:t>
+      </w:r>
+      <w:r>
+        <w:rPr>
+          <w:rFonts w:ascii="Times New Roman" w:hAnsi="Times New Roman" w:cs="Times New Roman"/>
+          <w:i/>
+          <w:iCs/>
+          <w:sz w:val="20"/>
+          <w:szCs w:val="20"/>
+        </w:rPr>
+        <w:t>B. melitensis</w:t>
+      </w:r>
+      <w:r>
+        <w:rPr>
+          <w:rFonts w:ascii="Times New Roman" w:hAnsi="Times New Roman" w:cs="Times New Roman"/>
+          <w:sz w:val="20"/>
+          <w:szCs w:val="20"/>
+        </w:rPr>
+        <w:t xml:space="preserve">. </w:t>
+      </w:r>
+      <w:r>
+        <w:rPr>
+          <w:rFonts w:ascii="Times New Roman" w:hAnsi="Times New Roman" w:cs="Times New Roman"/>
+          <w:sz w:val="20"/>
+          <w:szCs w:val="20"/>
+          <w:lang w:val="fr-CA"/>
+        </w:rPr>
+        <w:t>J Clin Microbiol. 2004;42(3):1290-3.</w:t>
       </w:r>
     </w:p>
     <w:p>
@@ -3212,13 +3244,7 @@
         <w:rPr>
           <w:rFonts w:ascii="Times New Roman" w:hAnsi="Times New Roman" w:cs="Times New Roman"/>
         </w:rPr>
-        <w:t xml:space="preserve"> Basecalled reads and the sequencing summary written by MinKNOW, or by the built-in simulator, are picked up by a directory watcher. Each batch of reads is passed to the configured classifier plug-in and the summary is passed to the run-health rules. Target metrics, feature metrics and run-health conditions are evaluated after every batch, and each alert is logged once, shown in the web interface and delivered through the configured notification channels. Laboratory results entered by the user are compared </w:t>
-      </w:r>
-      <w:r>
-        <w:rPr>
-          <w:rFonts w:ascii="Times New Roman" w:hAnsi="Times New Roman" w:cs="Times New Roman"/>
-        </w:rPr>
-        <w:t>with the sequencing result within the same project.</w:t>
+        <w:t xml:space="preserve"> Basecalled reads and the sequencing summary written by MinKNOW, or by the built-in simulator, are picked up by a directory watcher. Each batch of reads is passed to the configured classifier plug-in and the summary is passed to the run-health rules. Target metrics, feature metrics and run-health conditions are evaluated after every batch, and each alert is logged once, shown in the web interface and delivered through the configured notification channels. Laboratory results entered by the user are compared with the sequencing result within the same project.</w:t>
       </w:r>
     </w:p>
     <w:p>
@@ -3968,7 +3994,7 @@
                 <w:sz w:val="18"/>
                 <w:szCs w:val="18"/>
               </w:rPr>
-              <w:t>MinKNOW live alignment [6]</w:t>
+              <w:t>MinKNOW live alignment [9]</w:t>
             </w:r>
           </w:p>
         </w:tc>
@@ -4207,7 +4233,7 @@
                 <w:sz w:val="18"/>
                 <w:szCs w:val="18"/>
               </w:rPr>
-              <w:t>EPI2ME wf-metagenomics [6]</w:t>
+              <w:t>EPI2ME wf-metagenomics [9]</w:t>
             </w:r>
           </w:p>
         </w:tc>
@@ -4446,7 +4472,7 @@
                 <w:sz w:val="18"/>
                 <w:szCs w:val="18"/>
               </w:rPr>
-              <w:t>RAMPART [7]</w:t>
+              <w:t>RAMPART [10]</w:t>
             </w:r>
           </w:p>
         </w:tc>
@@ -4685,7 +4711,7 @@
                 <w:sz w:val="18"/>
                 <w:szCs w:val="18"/>
               </w:rPr>
-              <w:t>minoTour [8]</w:t>
+              <w:t>minoTour [11]</w:t>
             </w:r>
           </w:p>
         </w:tc>
@@ -4924,7 +4950,7 @@
                 <w:sz w:val="18"/>
                 <w:szCs w:val="18"/>
               </w:rPr>
-              <w:t>BoardION [9]</w:t>
+              <w:t>BoardION [12]</w:t>
             </w:r>
           </w:p>
         </w:tc>
@@ -5163,7 +5189,7 @@
                 <w:sz w:val="18"/>
                 <w:szCs w:val="18"/>
               </w:rPr>
-              <w:t>MARTi [10]</w:t>
+              <w:t>MARTi [13]</w:t>
             </w:r>
           </w:p>
         </w:tc>
@@ -5402,7 +5428,7 @@
                 <w:sz w:val="18"/>
                 <w:szCs w:val="18"/>
               </w:rPr>
-              <w:t>Nanometa Live [11]</w:t>
+              <w:t>Nanometa Live [14]</w:t>
             </w:r>
           </w:p>
         </w:tc>
@@ -5641,7 +5667,7 @@
                 <w:sz w:val="18"/>
                 <w:szCs w:val="18"/>
               </w:rPr>
-              <w:t>NanoOK RT [12]</w:t>
+              <w:t>NanoOK RT [15]</w:t>
             </w:r>
           </w:p>
         </w:tc>
@@ -5880,7 +5906,7 @@
                 <w:sz w:val="18"/>
                 <w:szCs w:val="18"/>
               </w:rPr>
-              <w:t>BugSeq [13]</w:t>
+              <w:t>BugSeq [16]</w:t>
             </w:r>
           </w:p>
         </w:tc>
@@ -6185,7 +6211,7 @@
                 <w:sz w:val="18"/>
                 <w:szCs w:val="18"/>
               </w:rPr>
-              <w:t>Yes: depth, breadth, reads, fraction, GFF features; e-mail, SMS, desktop, MinKNOW</w:t>
+              <w:t>Yes: depth, breadth, reads, fraction, GFF features. Delivered by e-mail, SMS, desktop, MinKNOW</w:t>
             </w:r>
           </w:p>
         </w:tc>
@@ -7754,6 +7780,42 @@
       </w:r>
     </w:p>
   </w:comment>
+  <w:comment w:id="23" w:author="Draft notes" w:date="2026-09-25T13:17:15Z" w:initials="DN">
+    <w:p>
+      <w:r>
+        <w:rPr>
+          <w:rStyle w:val="CommentReference"/>
+        </w:rPr>
+        <w:annotationRef/>
+      </w:r>
+      <w:r>
+        <w:rPr>
+          <w:color w:val="000000"/>
+          <w:sz w:val="20"/>
+          <w:szCs w:val="20"/>
+        </w:rPr>
+        <w:t xml:space="preserve">Rewritten. The previous version cited the 2010 Xylella and 2004 Brucella qPCR papers as evidence that targeted amplification is still the routine method, which they cannot show. The claim now rests on the current diagnostic standards (EPPO PM 7/24 (5), 2023; WOAH Terrestrial Manual chapter 3.1.4, 2022) and two recent reviews (2025 plant bacterial diagnostics; 2024 brucellosis). Harper 2010 is kept only where it is the assay actually used in case study 1, and Probert 2004 only as the source of the IS711 target. Olsen and Palmer 2014 was removed.</w:t>
+      </w:r>
+    </w:p>
+  </w:comment>
+  <w:comment w:id="24" w:author="Draft notes" w:date="2026-09-25T13:17:15Z" w:initials="DN">
+    <w:p>
+      <w:r>
+        <w:rPr>
+          <w:rStyle w:val="CommentReference"/>
+        </w:rPr>
+        <w:annotationRef/>
+      </w:r>
+      <w:r>
+        <w:rPr>
+          <w:color w:val="000000"/>
+          <w:sz w:val="20"/>
+          <w:szCs w:val="20"/>
+        </w:rPr>
+        <w:t xml:space="preserve">Reference list renumbered in order of first citation after the changes. Seven references were added (3, 4, 5, 6, 7, 31, 32, 33) and one removed. Please verify the new ones: for refs 3 and 33 I could only confirm the first three authors, so the author lists need completing to six names before et al.; ref 4 is the EPPO Bulletin standard (2023;53:205-276); ref 5 is the WOAH chapter, 2022 version; ref 32 is a 2026 article, check that the volume and article number are final.</w:t>
+      </w:r>
+    </w:p>
+  </w:comment>
 </w:comments>
 </file>
 
@@ -7782,7 +7844,16 @@
   <w15:commentEx w15:paraId="259269EA" w15:done="0"/>
   <w15:commentEx w15:paraId="7CF5F698" w15:done="0"/>
   <w15:commentEx w15:paraId="03021517" w15:done="0"/>
+  <w15:commentEx w15:paraId="770FB5BD" w15:done="0"/>
+  <w15:commentEx w15:paraId="4FE288EE" w15:done="0"/>
 </w15:commentsEx>
+</file>
+
+<file path=word/commentsExtensible.xml><?xml version="1.0" encoding="utf-8"?>
+<w16cex:commentsExtensible xmlns:wpc="http://schemas.microsoft.com/office/word/2010/wordprocessingCanvas" xmlns:cx="http://schemas.microsoft.com/office/drawing/2014/chartex" xmlns:cx1="http://schemas.microsoft.com/office/drawing/2015/9/8/chartex" xmlns:cx2="http://schemas.microsoft.com/office/drawing/2015/10/21/chartex" xmlns:cx3="http://schemas.microsoft.com/office/drawing/2016/5/9/chartex" xmlns:cx4="http://schemas.microsoft.com/office/drawing/2016/5/10/chartex" xmlns:cx5="http://schemas.microsoft.com/office/drawing/2016/5/11/chartex" xmlns:cx6="http://schemas.microsoft.com/office/drawing/2016/5/12/chartex" xmlns:cx7="http://schemas.microsoft.com/office/drawing/2016/5/13/chartex" xmlns:cx8="http://schemas.microsoft.com/office/drawing/2016/5/14/chartex" xmlns:mc="http://schemas.openxmlformats.org/markup-compatibility/2006" xmlns:aink="http://schemas.microsoft.com/office/drawing/2016/ink" xmlns:am3d="http://schemas.microsoft.com/office/drawing/2017/model3d" xmlns:o="urn:schemas-microsoft-com:office:office" xmlns:oel="http://schemas.microsoft.com/office/2019/extlst" xmlns:r="http://schemas.openxmlformats.org/officeDocument/2006/relationships" xmlns:m="http://schemas.openxmlformats.org/officeDocument/2006/math" xmlns:v="urn:schemas-microsoft-com:vml" xmlns:wp14="http://schemas.microsoft.com/office/word/2010/wordprocessingDrawing" xmlns:wp="http://schemas.openxmlformats.org/drawingml/2006/wordprocessingDrawing" xmlns:w10="urn:schemas-microsoft-com:office:word" xmlns:w="http://schemas.openxmlformats.org/wordprocessingml/2006/main" xmlns:w14="http://schemas.microsoft.com/office/word/2010/wordml" xmlns:w15="http://schemas.microsoft.com/office/word/2012/wordml" xmlns:w16cex="http://schemas.microsoft.com/office/word/2018/wordml/cex" xmlns:w16cid="http://schemas.microsoft.com/office/word/2016/wordml/cid" xmlns:w16="http://schemas.microsoft.com/office/word/2018/wordml" xmlns:w16du="http://schemas.microsoft.com/office/word/2023/wordml/word16du" xmlns:w16sdtdh="http://schemas.microsoft.com/office/word/2020/wordml/sdtdatahash" xmlns:w16sdtfl="http://schemas.microsoft.com/office/word/2024/wordml/sdtformatlock" xmlns:w16se="http://schemas.microsoft.com/office/word/2015/wordml/symex" xmlns:wpg="http://schemas.microsoft.com/office/word/2010/wordprocessingGroup" xmlns:wpi="http://schemas.microsoft.com/office/word/2010/wordprocessingInk" xmlns:wne="http://schemas.microsoft.com/office/word/2006/wordml" xmlns:wps="http://schemas.microsoft.com/office/word/2010/wordprocessingShape" xmlns:cr="http://schemas.microsoft.com/office/comments/2020/reactions" mc:Ignorable="w14 w15 w16se w16cid w16 w16cex w16sdtdh w16sdtfl cr w16du wp14">
+  <w16cex:commentExtensible w16cex:durableId="38F6DAB0" w16cex:dateUtc="2026-09-25T13:17:15Z"/>
+  <w16cex:commentExtensible w16cex:durableId="5DB93CD8" w16cex:dateUtc="2026-09-25T13:17:15Z"/>
+</w16cex:commentsExtensible>
 </file>
 
 <file path=word/commentsIds.xml><?xml version="1.0" encoding="utf-8"?>
@@ -7810,6 +7881,8 @@
   <w16cid:commentId w16cid:paraId="259269EA" w16cid:durableId="37DBB38E"/>
   <w16cid:commentId w16cid:paraId="7CF5F698" w16cid:durableId="088F5627"/>
   <w16cid:commentId w16cid:paraId="03021517" w16cid:durableId="647AE87D"/>
+  <w16cid:commentId w16cid:paraId="770FB5BD" w16cid:durableId="38F6DAB0"/>
+  <w16cid:commentId w16cid:paraId="4FE288EE" w16cid:durableId="5DB93CD8"/>
 </w16cid:commentsIds>
 </file>
 

</xml_diff>